<commit_message>
docs cleanup, information sheet polish
</commit_message>
<xml_diff>
--- a/resources/document-templates/startup-information-sheet-template.docx
+++ b/resources/document-templates/startup-information-sheet-template.docx
@@ -272,31 +272,7 @@
           <w:sz w:val="16"/>
           <w:szCs w:val="16"/>
         </w:rPr>
-        <w:t>Date Format (mm/dd/</w:t>
-      </w:r>
-      <w:proofErr w:type="spellStart"/>
-      <w:r>
-        <w:rPr>
-          <w:rFonts w:ascii="Times New Roman" w:eastAsia="Times New Roman" w:hAnsi="Times New Roman" w:cs="Times New Roman"/>
-          <w:i/>
-          <w:iCs/>
-          <w:color w:val="000000"/>
-          <w:sz w:val="16"/>
-          <w:szCs w:val="16"/>
-        </w:rPr>
-        <w:t>yyyy</w:t>
-      </w:r>
-      <w:proofErr w:type="spellEnd"/>
-      <w:r>
-        <w:rPr>
-          <w:rFonts w:ascii="Times New Roman" w:eastAsia="Times New Roman" w:hAnsi="Times New Roman" w:cs="Times New Roman"/>
-          <w:i/>
-          <w:iCs/>
-          <w:color w:val="000000"/>
-          <w:sz w:val="16"/>
-          <w:szCs w:val="16"/>
-        </w:rPr>
-        <w:t>)</w:t>
+        <w:t>Date Format (mm/dd/yyyy)</w:t>
       </w:r>
     </w:p>
     <w:p>
@@ -463,8 +439,6 @@
               <w:jc w:val="both"/>
               <w:rPr>
                 <w:rFonts w:ascii="Times New Roman" w:eastAsia="Times New Roman" w:hAnsi="Times New Roman" w:cs="Times New Roman"/>
-                <w:b/>
-                <w:bCs/>
                 <w:sz w:val="18"/>
                 <w:szCs w:val="18"/>
                 <w:u w:val="single"/>
@@ -473,8 +447,6 @@
             <w:r>
               <w:rPr>
                 <w:rFonts w:ascii="Times New Roman" w:eastAsia="Times New Roman" w:hAnsi="Times New Roman" w:cs="Times New Roman"/>
-                <w:b/>
-                <w:bCs/>
                 <w:sz w:val="18"/>
                 <w:szCs w:val="18"/>
                 <w:u w:val="single"/>
@@ -527,8 +499,6 @@
               <w:spacing w:after="0"/>
               <w:rPr>
                 <w:rFonts w:ascii="Times New Roman" w:eastAsia="Times New Roman" w:hAnsi="Times New Roman" w:cs="Times New Roman"/>
-                <w:b/>
-                <w:bCs/>
                 <w:sz w:val="18"/>
                 <w:szCs w:val="18"/>
                 <w:u w:val="single"/>
@@ -537,8 +507,6 @@
             <w:r>
               <w:rPr>
                 <w:rFonts w:ascii="Times New Roman" w:eastAsia="Times New Roman" w:hAnsi="Times New Roman" w:cs="Times New Roman"/>
-                <w:b/>
-                <w:bCs/>
                 <w:sz w:val="18"/>
                 <w:szCs w:val="18"/>
                 <w:u w:val="single"/>
@@ -611,8 +579,6 @@
               <w:jc w:val="both"/>
               <w:rPr>
                 <w:rFonts w:ascii="Times New Roman" w:eastAsia="Times New Roman" w:hAnsi="Times New Roman" w:cs="Times New Roman"/>
-                <w:b/>
-                <w:bCs/>
                 <w:sz w:val="18"/>
                 <w:szCs w:val="18"/>
                 <w:u w:val="single"/>
@@ -621,37 +587,11 @@
             <w:r>
               <w:rPr>
                 <w:rFonts w:ascii="Times New Roman" w:eastAsia="Times New Roman" w:hAnsi="Times New Roman" w:cs="Times New Roman"/>
-                <w:b/>
-                <w:bCs/>
                 <w:sz w:val="18"/>
                 <w:szCs w:val="18"/>
                 <w:u w:val="single"/>
               </w:rPr>
-              <w:t>${</w:t>
-            </w:r>
-            <w:proofErr w:type="spellStart"/>
-            <w:r>
-              <w:rPr>
-                <w:rFonts w:ascii="Times New Roman" w:eastAsia="Times New Roman" w:hAnsi="Times New Roman" w:cs="Times New Roman"/>
-                <w:b/>
-                <w:bCs/>
-                <w:sz w:val="18"/>
-                <w:szCs w:val="18"/>
-                <w:u w:val="single"/>
-              </w:rPr>
-              <w:t>first_name</w:t>
-            </w:r>
-            <w:proofErr w:type="spellEnd"/>
-            <w:r>
-              <w:rPr>
-                <w:rFonts w:ascii="Times New Roman" w:eastAsia="Times New Roman" w:hAnsi="Times New Roman" w:cs="Times New Roman"/>
-                <w:b/>
-                <w:bCs/>
-                <w:sz w:val="18"/>
-                <w:szCs w:val="18"/>
-                <w:u w:val="single"/>
-              </w:rPr>
-              <w:t>}</w:t>
+              <w:t>${first_name}</w:t>
             </w:r>
           </w:p>
         </w:tc>
@@ -701,8 +641,6 @@
               <w:jc w:val="both"/>
               <w:rPr>
                 <w:rFonts w:ascii="Times New Roman" w:eastAsia="Times New Roman" w:hAnsi="Times New Roman" w:cs="Times New Roman"/>
-                <w:b/>
-                <w:bCs/>
                 <w:sz w:val="18"/>
                 <w:szCs w:val="18"/>
                 <w:u w:val="single"/>
@@ -711,37 +649,11 @@
             <w:r>
               <w:rPr>
                 <w:rFonts w:ascii="Times New Roman" w:eastAsia="Times New Roman" w:hAnsi="Times New Roman" w:cs="Times New Roman"/>
-                <w:b/>
-                <w:bCs/>
                 <w:sz w:val="18"/>
                 <w:szCs w:val="18"/>
                 <w:u w:val="single"/>
               </w:rPr>
-              <w:t>${</w:t>
-            </w:r>
-            <w:proofErr w:type="spellStart"/>
-            <w:r>
-              <w:rPr>
-                <w:rFonts w:ascii="Times New Roman" w:eastAsia="Times New Roman" w:hAnsi="Times New Roman" w:cs="Times New Roman"/>
-                <w:b/>
-                <w:bCs/>
-                <w:sz w:val="18"/>
-                <w:szCs w:val="18"/>
-                <w:u w:val="single"/>
-              </w:rPr>
-              <w:t>civil_status</w:t>
-            </w:r>
-            <w:proofErr w:type="spellEnd"/>
-            <w:r>
-              <w:rPr>
-                <w:rFonts w:ascii="Times New Roman" w:eastAsia="Times New Roman" w:hAnsi="Times New Roman" w:cs="Times New Roman"/>
-                <w:b/>
-                <w:bCs/>
-                <w:sz w:val="18"/>
-                <w:szCs w:val="18"/>
-                <w:u w:val="single"/>
-              </w:rPr>
-              <w:t>}</w:t>
+              <w:t>${civil_status}</w:t>
             </w:r>
           </w:p>
         </w:tc>
@@ -809,8 +721,6 @@
               <w:jc w:val="both"/>
               <w:rPr>
                 <w:rFonts w:ascii="Times New Roman" w:eastAsia="Times New Roman" w:hAnsi="Times New Roman" w:cs="Times New Roman"/>
-                <w:b/>
-                <w:bCs/>
                 <w:sz w:val="18"/>
                 <w:szCs w:val="18"/>
                 <w:u w:val="single"/>
@@ -819,37 +729,11 @@
             <w:r>
               <w:rPr>
                 <w:rFonts w:ascii="Times New Roman" w:eastAsia="Times New Roman" w:hAnsi="Times New Roman" w:cs="Times New Roman"/>
-                <w:b/>
-                <w:bCs/>
                 <w:sz w:val="18"/>
                 <w:szCs w:val="18"/>
                 <w:u w:val="single"/>
               </w:rPr>
-              <w:t>${</w:t>
-            </w:r>
-            <w:proofErr w:type="spellStart"/>
-            <w:r>
-              <w:rPr>
-                <w:rFonts w:ascii="Times New Roman" w:eastAsia="Times New Roman" w:hAnsi="Times New Roman" w:cs="Times New Roman"/>
-                <w:b/>
-                <w:bCs/>
-                <w:sz w:val="18"/>
-                <w:szCs w:val="18"/>
-                <w:u w:val="single"/>
-              </w:rPr>
-              <w:t>middle_name</w:t>
-            </w:r>
-            <w:proofErr w:type="spellEnd"/>
-            <w:r>
-              <w:rPr>
-                <w:rFonts w:ascii="Times New Roman" w:eastAsia="Times New Roman" w:hAnsi="Times New Roman" w:cs="Times New Roman"/>
-                <w:b/>
-                <w:bCs/>
-                <w:sz w:val="18"/>
-                <w:szCs w:val="18"/>
-                <w:u w:val="single"/>
-              </w:rPr>
-              <w:t>}</w:t>
+              <w:t>${middle_name}</w:t>
             </w:r>
           </w:p>
         </w:tc>
@@ -899,8 +783,6 @@
               <w:jc w:val="both"/>
               <w:rPr>
                 <w:rFonts w:ascii="Times New Roman" w:eastAsia="Times New Roman" w:hAnsi="Times New Roman" w:cs="Times New Roman"/>
-                <w:b/>
-                <w:bCs/>
                 <w:sz w:val="18"/>
                 <w:szCs w:val="18"/>
                 <w:u w:val="single"/>
@@ -972,8 +854,6 @@
               <w:jc w:val="both"/>
               <w:rPr>
                 <w:rFonts w:ascii="Times New Roman" w:eastAsia="Times New Roman" w:hAnsi="Times New Roman" w:cs="Times New Roman"/>
-                <w:b/>
-                <w:bCs/>
                 <w:sz w:val="18"/>
                 <w:szCs w:val="18"/>
                 <w:u w:val="single"/>
@@ -982,37 +862,11 @@
             <w:r>
               <w:rPr>
                 <w:rFonts w:ascii="Times New Roman" w:eastAsia="Times New Roman" w:hAnsi="Times New Roman" w:cs="Times New Roman"/>
-                <w:b/>
-                <w:bCs/>
                 <w:sz w:val="18"/>
                 <w:szCs w:val="18"/>
                 <w:u w:val="single"/>
               </w:rPr>
-              <w:t>${</w:t>
-            </w:r>
-            <w:proofErr w:type="spellStart"/>
-            <w:r>
-              <w:rPr>
-                <w:rFonts w:ascii="Times New Roman" w:eastAsia="Times New Roman" w:hAnsi="Times New Roman" w:cs="Times New Roman"/>
-                <w:b/>
-                <w:bCs/>
-                <w:sz w:val="18"/>
-                <w:szCs w:val="18"/>
-                <w:u w:val="single"/>
-              </w:rPr>
-              <w:t>name_extension</w:t>
-            </w:r>
-            <w:proofErr w:type="spellEnd"/>
-            <w:r>
-              <w:rPr>
-                <w:rFonts w:ascii="Times New Roman" w:eastAsia="Times New Roman" w:hAnsi="Times New Roman" w:cs="Times New Roman"/>
-                <w:b/>
-                <w:bCs/>
-                <w:sz w:val="18"/>
-                <w:szCs w:val="18"/>
-                <w:u w:val="single"/>
-              </w:rPr>
-              <w:t>}</w:t>
+              <w:t>${name_extension}</w:t>
             </w:r>
           </w:p>
         </w:tc>
@@ -1077,8 +931,6 @@
               <w:jc w:val="both"/>
               <w:rPr>
                 <w:rFonts w:ascii="Times New Roman" w:eastAsia="Times New Roman" w:hAnsi="Times New Roman" w:cs="Times New Roman"/>
-                <w:b/>
-                <w:bCs/>
                 <w:sz w:val="18"/>
                 <w:szCs w:val="18"/>
                 <w:u w:val="single"/>
@@ -1087,37 +939,11 @@
             <w:r>
               <w:rPr>
                 <w:rFonts w:ascii="Times New Roman" w:eastAsia="Times New Roman" w:hAnsi="Times New Roman" w:cs="Times New Roman"/>
-                <w:b/>
-                <w:bCs/>
                 <w:sz w:val="18"/>
                 <w:szCs w:val="18"/>
                 <w:u w:val="single"/>
               </w:rPr>
-              <w:t>${</w:t>
-            </w:r>
-            <w:proofErr w:type="spellStart"/>
-            <w:r>
-              <w:rPr>
-                <w:rFonts w:ascii="Times New Roman" w:eastAsia="Times New Roman" w:hAnsi="Times New Roman" w:cs="Times New Roman"/>
-                <w:b/>
-                <w:bCs/>
-                <w:sz w:val="18"/>
-                <w:szCs w:val="18"/>
-                <w:u w:val="single"/>
-              </w:rPr>
-              <w:t>citizenship_by_birth</w:t>
-            </w:r>
-            <w:proofErr w:type="spellEnd"/>
-            <w:r>
-              <w:rPr>
-                <w:rFonts w:ascii="Times New Roman" w:eastAsia="Times New Roman" w:hAnsi="Times New Roman" w:cs="Times New Roman"/>
-                <w:b/>
-                <w:bCs/>
-                <w:sz w:val="18"/>
-                <w:szCs w:val="18"/>
-                <w:u w:val="single"/>
-              </w:rPr>
-              <w:t>}</w:t>
+              <w:t>${citizenship_by_birth}</w:t>
             </w:r>
           </w:p>
         </w:tc>
@@ -1223,8 +1049,6 @@
               <w:jc w:val="both"/>
               <w:rPr>
                 <w:rFonts w:ascii="Times New Roman" w:eastAsia="Times New Roman" w:hAnsi="Times New Roman" w:cs="Times New Roman"/>
-                <w:b/>
-                <w:bCs/>
                 <w:sz w:val="18"/>
                 <w:szCs w:val="18"/>
                 <w:u w:val="single"/>
@@ -1233,37 +1057,11 @@
             <w:r>
               <w:rPr>
                 <w:rFonts w:ascii="Times New Roman" w:eastAsia="Times New Roman" w:hAnsi="Times New Roman" w:cs="Times New Roman"/>
-                <w:b/>
-                <w:bCs/>
                 <w:sz w:val="18"/>
                 <w:szCs w:val="18"/>
                 <w:u w:val="single"/>
               </w:rPr>
-              <w:t>${</w:t>
-            </w:r>
-            <w:proofErr w:type="spellStart"/>
-            <w:r>
-              <w:rPr>
-                <w:rFonts w:ascii="Times New Roman" w:eastAsia="Times New Roman" w:hAnsi="Times New Roman" w:cs="Times New Roman"/>
-                <w:b/>
-                <w:bCs/>
-                <w:sz w:val="18"/>
-                <w:szCs w:val="18"/>
-                <w:u w:val="single"/>
-              </w:rPr>
-              <w:t>height_m</w:t>
-            </w:r>
-            <w:proofErr w:type="spellEnd"/>
-            <w:r>
-              <w:rPr>
-                <w:rFonts w:ascii="Times New Roman" w:eastAsia="Times New Roman" w:hAnsi="Times New Roman" w:cs="Times New Roman"/>
-                <w:b/>
-                <w:bCs/>
-                <w:sz w:val="18"/>
-                <w:szCs w:val="18"/>
-                <w:u w:val="single"/>
-              </w:rPr>
-              <w:t>}</w:t>
+              <w:t>${height_m}</w:t>
             </w:r>
           </w:p>
         </w:tc>
@@ -1325,8 +1123,6 @@
               <w:jc w:val="both"/>
               <w:rPr>
                 <w:rFonts w:ascii="Times New Roman" w:eastAsia="Times New Roman" w:hAnsi="Times New Roman" w:cs="Times New Roman"/>
-                <w:b/>
-                <w:bCs/>
                 <w:sz w:val="18"/>
                 <w:szCs w:val="18"/>
                 <w:u w:val="single"/>
@@ -1335,37 +1131,11 @@
             <w:r>
               <w:rPr>
                 <w:rFonts w:ascii="Times New Roman" w:eastAsia="Times New Roman" w:hAnsi="Times New Roman" w:cs="Times New Roman"/>
-                <w:b/>
-                <w:bCs/>
                 <w:sz w:val="18"/>
                 <w:szCs w:val="18"/>
                 <w:u w:val="single"/>
               </w:rPr>
-              <w:t>${</w:t>
-            </w:r>
-            <w:proofErr w:type="spellStart"/>
-            <w:r>
-              <w:rPr>
-                <w:rFonts w:ascii="Times New Roman" w:eastAsia="Times New Roman" w:hAnsi="Times New Roman" w:cs="Times New Roman"/>
-                <w:b/>
-                <w:bCs/>
-                <w:sz w:val="18"/>
-                <w:szCs w:val="18"/>
-                <w:u w:val="single"/>
-              </w:rPr>
-              <w:t>citizenship_dual</w:t>
-            </w:r>
-            <w:proofErr w:type="spellEnd"/>
-            <w:r>
-              <w:rPr>
-                <w:rFonts w:ascii="Times New Roman" w:eastAsia="Times New Roman" w:hAnsi="Times New Roman" w:cs="Times New Roman"/>
-                <w:b/>
-                <w:bCs/>
-                <w:sz w:val="18"/>
-                <w:szCs w:val="18"/>
-                <w:u w:val="single"/>
-              </w:rPr>
-              <w:t>}</w:t>
+              <w:t>${citizenship_dual}</w:t>
             </w:r>
           </w:p>
         </w:tc>
@@ -1435,8 +1205,6 @@
               <w:jc w:val="both"/>
               <w:rPr>
                 <w:rFonts w:ascii="Times New Roman" w:eastAsia="Times New Roman" w:hAnsi="Times New Roman" w:cs="Times New Roman"/>
-                <w:b/>
-                <w:bCs/>
                 <w:sz w:val="18"/>
                 <w:szCs w:val="18"/>
                 <w:u w:val="single"/>
@@ -1445,37 +1213,11 @@
             <w:r>
               <w:rPr>
                 <w:rFonts w:ascii="Times New Roman" w:eastAsia="Times New Roman" w:hAnsi="Times New Roman" w:cs="Times New Roman"/>
-                <w:b/>
-                <w:bCs/>
                 <w:sz w:val="18"/>
                 <w:szCs w:val="18"/>
                 <w:u w:val="single"/>
               </w:rPr>
-              <w:t>${</w:t>
-            </w:r>
-            <w:proofErr w:type="spellStart"/>
-            <w:r>
-              <w:rPr>
-                <w:rFonts w:ascii="Times New Roman" w:eastAsia="Times New Roman" w:hAnsi="Times New Roman" w:cs="Times New Roman"/>
-                <w:b/>
-                <w:bCs/>
-                <w:sz w:val="18"/>
-                <w:szCs w:val="18"/>
-                <w:u w:val="single"/>
-              </w:rPr>
-              <w:t>weight_kg</w:t>
-            </w:r>
-            <w:proofErr w:type="spellEnd"/>
-            <w:r>
-              <w:rPr>
-                <w:rFonts w:ascii="Times New Roman" w:eastAsia="Times New Roman" w:hAnsi="Times New Roman" w:cs="Times New Roman"/>
-                <w:b/>
-                <w:bCs/>
-                <w:sz w:val="18"/>
-                <w:szCs w:val="18"/>
-                <w:u w:val="single"/>
-              </w:rPr>
-              <w:t>}</w:t>
+              <w:t>${weight_kg}</w:t>
             </w:r>
           </w:p>
         </w:tc>
@@ -1545,8 +1287,6 @@
               <w:jc w:val="both"/>
               <w:rPr>
                 <w:rFonts w:ascii="Times New Roman" w:eastAsia="Times New Roman" w:hAnsi="Times New Roman" w:cs="Times New Roman"/>
-                <w:b/>
-                <w:bCs/>
                 <w:sz w:val="18"/>
                 <w:szCs w:val="18"/>
                 <w:u w:val="single"/>
@@ -1555,37 +1295,11 @@
             <w:r>
               <w:rPr>
                 <w:rFonts w:ascii="Times New Roman" w:eastAsia="Times New Roman" w:hAnsi="Times New Roman" w:cs="Times New Roman"/>
-                <w:b/>
-                <w:bCs/>
                 <w:sz w:val="18"/>
                 <w:szCs w:val="18"/>
                 <w:u w:val="single"/>
               </w:rPr>
-              <w:t>${</w:t>
-            </w:r>
-            <w:proofErr w:type="spellStart"/>
-            <w:r>
-              <w:rPr>
-                <w:rFonts w:ascii="Times New Roman" w:eastAsia="Times New Roman" w:hAnsi="Times New Roman" w:cs="Times New Roman"/>
-                <w:b/>
-                <w:bCs/>
-                <w:sz w:val="18"/>
-                <w:szCs w:val="18"/>
-                <w:u w:val="single"/>
-              </w:rPr>
-              <w:t>blood_type</w:t>
-            </w:r>
-            <w:proofErr w:type="spellEnd"/>
-            <w:r>
-              <w:rPr>
-                <w:rFonts w:ascii="Times New Roman" w:eastAsia="Times New Roman" w:hAnsi="Times New Roman" w:cs="Times New Roman"/>
-                <w:b/>
-                <w:bCs/>
-                <w:sz w:val="18"/>
-                <w:szCs w:val="18"/>
-                <w:u w:val="single"/>
-              </w:rPr>
-              <w:t>}</w:t>
+              <w:t>${blood_type}</w:t>
             </w:r>
           </w:p>
         </w:tc>
@@ -1677,6 +1391,35 @@
               <w:jc w:val="both"/>
               <w:rPr>
                 <w:rFonts w:ascii="Times New Roman" w:eastAsia="Times New Roman" w:hAnsi="Times New Roman" w:cs="Times New Roman"/>
+                <w:sz w:val="18"/>
+                <w:szCs w:val="18"/>
+                <w:u w:val="single"/>
+              </w:rPr>
+            </w:pPr>
+            <w:r>
+              <w:rPr>
+                <w:rFonts w:ascii="Times New Roman" w:eastAsia="Times New Roman" w:hAnsi="Times New Roman" w:cs="Times New Roman"/>
+                <w:sz w:val="18"/>
+                <w:szCs w:val="18"/>
+                <w:u w:val="single"/>
+              </w:rPr>
+              <w:t>${gsis_no}</w:t>
+            </w:r>
+          </w:p>
+        </w:tc>
+        <w:tc>
+          <w:tcPr>
+            <w:tcW w:w="1980" w:type="dxa"/>
+            <w:tcBorders>
+              <w:right w:val="single" w:sz="4" w:space="0" w:color="auto"/>
+            </w:tcBorders>
+          </w:tcPr>
+          <w:p>
+            <w:pPr>
+              <w:spacing w:after="0"/>
+              <w:jc w:val="both"/>
+              <w:rPr>
+                <w:rFonts w:ascii="Times New Roman" w:eastAsia="Times New Roman" w:hAnsi="Times New Roman" w:cs="Times New Roman"/>
                 <w:b/>
                 <w:bCs/>
                 <w:sz w:val="18"/>
@@ -1687,124 +1430,39 @@
             <w:r>
               <w:rPr>
                 <w:rFonts w:ascii="Times New Roman" w:eastAsia="Times New Roman" w:hAnsi="Times New Roman" w:cs="Times New Roman"/>
-                <w:b/>
-                <w:bCs/>
+                <w:sz w:val="18"/>
+                <w:szCs w:val="18"/>
+              </w:rPr>
+              <w:t>18. PLACE OF BIRTH:</w:t>
+            </w:r>
+          </w:p>
+        </w:tc>
+        <w:tc>
+          <w:tcPr>
+            <w:tcW w:w="2633" w:type="dxa"/>
+            <w:tcBorders>
+              <w:left w:val="single" w:sz="4" w:space="0" w:color="auto"/>
+            </w:tcBorders>
+          </w:tcPr>
+          <w:p>
+            <w:pPr>
+              <w:spacing w:after="0"/>
+              <w:jc w:val="both"/>
+              <w:rPr>
+                <w:rFonts w:ascii="Times New Roman" w:eastAsia="Times New Roman" w:hAnsi="Times New Roman" w:cs="Times New Roman"/>
                 <w:sz w:val="18"/>
                 <w:szCs w:val="18"/>
                 <w:u w:val="single"/>
               </w:rPr>
-              <w:t>${</w:t>
-            </w:r>
-            <w:proofErr w:type="spellStart"/>
-            <w:r>
-              <w:rPr>
-                <w:rFonts w:ascii="Times New Roman" w:eastAsia="Times New Roman" w:hAnsi="Times New Roman" w:cs="Times New Roman"/>
-                <w:b/>
-                <w:bCs/>
+            </w:pPr>
+            <w:r>
+              <w:rPr>
+                <w:rFonts w:ascii="Times New Roman" w:eastAsia="Times New Roman" w:hAnsi="Times New Roman" w:cs="Times New Roman"/>
                 <w:sz w:val="18"/>
                 <w:szCs w:val="18"/>
                 <w:u w:val="single"/>
               </w:rPr>
-              <w:t>gsis_no</w:t>
-            </w:r>
-            <w:proofErr w:type="spellEnd"/>
-            <w:r>
-              <w:rPr>
-                <w:rFonts w:ascii="Times New Roman" w:eastAsia="Times New Roman" w:hAnsi="Times New Roman" w:cs="Times New Roman"/>
-                <w:b/>
-                <w:bCs/>
-                <w:sz w:val="18"/>
-                <w:szCs w:val="18"/>
-                <w:u w:val="single"/>
-              </w:rPr>
-              <w:t>}</w:t>
-            </w:r>
-          </w:p>
-        </w:tc>
-        <w:tc>
-          <w:tcPr>
-            <w:tcW w:w="1980" w:type="dxa"/>
-            <w:tcBorders>
-              <w:right w:val="single" w:sz="4" w:space="0" w:color="auto"/>
-            </w:tcBorders>
-          </w:tcPr>
-          <w:p>
-            <w:pPr>
-              <w:spacing w:after="0"/>
-              <w:jc w:val="both"/>
-              <w:rPr>
-                <w:rFonts w:ascii="Times New Roman" w:eastAsia="Times New Roman" w:hAnsi="Times New Roman" w:cs="Times New Roman"/>
-                <w:b/>
-                <w:bCs/>
-                <w:sz w:val="18"/>
-                <w:szCs w:val="18"/>
-                <w:u w:val="single"/>
-              </w:rPr>
-            </w:pPr>
-            <w:r>
-              <w:rPr>
-                <w:rFonts w:ascii="Times New Roman" w:eastAsia="Times New Roman" w:hAnsi="Times New Roman" w:cs="Times New Roman"/>
-                <w:sz w:val="18"/>
-                <w:szCs w:val="18"/>
-              </w:rPr>
-              <w:t>18. PLACE OF BIRTH:</w:t>
-            </w:r>
-          </w:p>
-        </w:tc>
-        <w:tc>
-          <w:tcPr>
-            <w:tcW w:w="2633" w:type="dxa"/>
-            <w:tcBorders>
-              <w:left w:val="single" w:sz="4" w:space="0" w:color="auto"/>
-            </w:tcBorders>
-          </w:tcPr>
-          <w:p>
-            <w:pPr>
-              <w:spacing w:after="0"/>
-              <w:jc w:val="both"/>
-              <w:rPr>
-                <w:rFonts w:ascii="Times New Roman" w:eastAsia="Times New Roman" w:hAnsi="Times New Roman" w:cs="Times New Roman"/>
-                <w:b/>
-                <w:bCs/>
-                <w:sz w:val="18"/>
-                <w:szCs w:val="18"/>
-                <w:u w:val="single"/>
-              </w:rPr>
-            </w:pPr>
-            <w:r>
-              <w:rPr>
-                <w:rFonts w:ascii="Times New Roman" w:eastAsia="Times New Roman" w:hAnsi="Times New Roman" w:cs="Times New Roman"/>
-                <w:b/>
-                <w:bCs/>
-                <w:sz w:val="18"/>
-                <w:szCs w:val="18"/>
-                <w:u w:val="single"/>
-              </w:rPr>
-              <w:t>${</w:t>
-            </w:r>
-            <w:proofErr w:type="spellStart"/>
-            <w:r>
-              <w:rPr>
-                <w:rFonts w:ascii="Times New Roman" w:eastAsia="Times New Roman" w:hAnsi="Times New Roman" w:cs="Times New Roman"/>
-                <w:b/>
-                <w:bCs/>
-                <w:sz w:val="18"/>
-                <w:szCs w:val="18"/>
-                <w:u w:val="single"/>
-              </w:rPr>
-              <w:t>place_of_birth</w:t>
-            </w:r>
-            <w:proofErr w:type="spellEnd"/>
-            <w:r>
-              <w:rPr>
-                <w:rFonts w:ascii="Times New Roman" w:eastAsia="Times New Roman" w:hAnsi="Times New Roman" w:cs="Times New Roman"/>
-                <w:b/>
-                <w:bCs/>
-                <w:sz w:val="18"/>
-                <w:szCs w:val="18"/>
-                <w:u w:val="single"/>
-              </w:rPr>
-              <w:t>}</w:t>
+              <w:t>${place_of_birth}</w:t>
             </w:r>
           </w:p>
         </w:tc>
@@ -1866,6 +1524,35 @@
               <w:jc w:val="both"/>
               <w:rPr>
                 <w:rFonts w:ascii="Times New Roman" w:eastAsia="Times New Roman" w:hAnsi="Times New Roman" w:cs="Times New Roman"/>
+                <w:sz w:val="18"/>
+                <w:szCs w:val="18"/>
+                <w:u w:val="single"/>
+              </w:rPr>
+            </w:pPr>
+            <w:r>
+              <w:rPr>
+                <w:rFonts w:ascii="Times New Roman" w:eastAsia="Times New Roman" w:hAnsi="Times New Roman" w:cs="Times New Roman"/>
+                <w:sz w:val="18"/>
+                <w:szCs w:val="18"/>
+                <w:u w:val="single"/>
+              </w:rPr>
+              <w:t>${pagibig_no}</w:t>
+            </w:r>
+          </w:p>
+        </w:tc>
+        <w:tc>
+          <w:tcPr>
+            <w:tcW w:w="1980" w:type="dxa"/>
+            <w:tcBorders>
+              <w:right w:val="single" w:sz="4" w:space="0" w:color="auto"/>
+            </w:tcBorders>
+          </w:tcPr>
+          <w:p>
+            <w:pPr>
+              <w:spacing w:after="0"/>
+              <w:jc w:val="both"/>
+              <w:rPr>
+                <w:rFonts w:ascii="Times New Roman" w:eastAsia="Times New Roman" w:hAnsi="Times New Roman" w:cs="Times New Roman"/>
                 <w:b/>
                 <w:bCs/>
                 <w:sz w:val="18"/>
@@ -1876,124 +1563,39 @@
             <w:r>
               <w:rPr>
                 <w:rFonts w:ascii="Times New Roman" w:eastAsia="Times New Roman" w:hAnsi="Times New Roman" w:cs="Times New Roman"/>
-                <w:b/>
-                <w:bCs/>
+                <w:sz w:val="18"/>
+                <w:szCs w:val="18"/>
+              </w:rPr>
+              <w:t>19. DATE OF BIRTH:</w:t>
+            </w:r>
+          </w:p>
+        </w:tc>
+        <w:tc>
+          <w:tcPr>
+            <w:tcW w:w="2633" w:type="dxa"/>
+            <w:tcBorders>
+              <w:left w:val="single" w:sz="4" w:space="0" w:color="auto"/>
+            </w:tcBorders>
+          </w:tcPr>
+          <w:p>
+            <w:pPr>
+              <w:spacing w:after="0"/>
+              <w:jc w:val="both"/>
+              <w:rPr>
+                <w:rFonts w:ascii="Times New Roman" w:eastAsia="Times New Roman" w:hAnsi="Times New Roman" w:cs="Times New Roman"/>
                 <w:sz w:val="18"/>
                 <w:szCs w:val="18"/>
                 <w:u w:val="single"/>
               </w:rPr>
-              <w:t>${</w:t>
-            </w:r>
-            <w:proofErr w:type="spellStart"/>
-            <w:r>
-              <w:rPr>
-                <w:rFonts w:ascii="Times New Roman" w:eastAsia="Times New Roman" w:hAnsi="Times New Roman" w:cs="Times New Roman"/>
-                <w:b/>
-                <w:bCs/>
+            </w:pPr>
+            <w:r>
+              <w:rPr>
+                <w:rFonts w:ascii="Times New Roman" w:eastAsia="Times New Roman" w:hAnsi="Times New Roman" w:cs="Times New Roman"/>
                 <w:sz w:val="18"/>
                 <w:szCs w:val="18"/>
                 <w:u w:val="single"/>
               </w:rPr>
-              <w:t>pagibig_no</w:t>
-            </w:r>
-            <w:proofErr w:type="spellEnd"/>
-            <w:r>
-              <w:rPr>
-                <w:rFonts w:ascii="Times New Roman" w:eastAsia="Times New Roman" w:hAnsi="Times New Roman" w:cs="Times New Roman"/>
-                <w:b/>
-                <w:bCs/>
-                <w:sz w:val="18"/>
-                <w:szCs w:val="18"/>
-                <w:u w:val="single"/>
-              </w:rPr>
-              <w:t>}</w:t>
-            </w:r>
-          </w:p>
-        </w:tc>
-        <w:tc>
-          <w:tcPr>
-            <w:tcW w:w="1980" w:type="dxa"/>
-            <w:tcBorders>
-              <w:right w:val="single" w:sz="4" w:space="0" w:color="auto"/>
-            </w:tcBorders>
-          </w:tcPr>
-          <w:p>
-            <w:pPr>
-              <w:spacing w:after="0"/>
-              <w:jc w:val="both"/>
-              <w:rPr>
-                <w:rFonts w:ascii="Times New Roman" w:eastAsia="Times New Roman" w:hAnsi="Times New Roman" w:cs="Times New Roman"/>
-                <w:b/>
-                <w:bCs/>
-                <w:sz w:val="18"/>
-                <w:szCs w:val="18"/>
-                <w:u w:val="single"/>
-              </w:rPr>
-            </w:pPr>
-            <w:r>
-              <w:rPr>
-                <w:rFonts w:ascii="Times New Roman" w:eastAsia="Times New Roman" w:hAnsi="Times New Roman" w:cs="Times New Roman"/>
-                <w:sz w:val="18"/>
-                <w:szCs w:val="18"/>
-              </w:rPr>
-              <w:t>19. DATE OF BIRTH:</w:t>
-            </w:r>
-          </w:p>
-        </w:tc>
-        <w:tc>
-          <w:tcPr>
-            <w:tcW w:w="2633" w:type="dxa"/>
-            <w:tcBorders>
-              <w:left w:val="single" w:sz="4" w:space="0" w:color="auto"/>
-            </w:tcBorders>
-          </w:tcPr>
-          <w:p>
-            <w:pPr>
-              <w:spacing w:after="0"/>
-              <w:jc w:val="both"/>
-              <w:rPr>
-                <w:rFonts w:ascii="Times New Roman" w:eastAsia="Times New Roman" w:hAnsi="Times New Roman" w:cs="Times New Roman"/>
-                <w:b/>
-                <w:bCs/>
-                <w:sz w:val="18"/>
-                <w:szCs w:val="18"/>
-                <w:u w:val="single"/>
-              </w:rPr>
-            </w:pPr>
-            <w:r>
-              <w:rPr>
-                <w:rFonts w:ascii="Times New Roman" w:eastAsia="Times New Roman" w:hAnsi="Times New Roman" w:cs="Times New Roman"/>
-                <w:b/>
-                <w:bCs/>
-                <w:sz w:val="18"/>
-                <w:szCs w:val="18"/>
-                <w:u w:val="single"/>
-              </w:rPr>
-              <w:t>${</w:t>
-            </w:r>
-            <w:proofErr w:type="spellStart"/>
-            <w:r>
-              <w:rPr>
-                <w:rFonts w:ascii="Times New Roman" w:eastAsia="Times New Roman" w:hAnsi="Times New Roman" w:cs="Times New Roman"/>
-                <w:b/>
-                <w:bCs/>
-                <w:sz w:val="18"/>
-                <w:szCs w:val="18"/>
-                <w:u w:val="single"/>
-              </w:rPr>
-              <w:t>date_of_birth</w:t>
-            </w:r>
-            <w:proofErr w:type="spellEnd"/>
-            <w:r>
-              <w:rPr>
-                <w:rFonts w:ascii="Times New Roman" w:eastAsia="Times New Roman" w:hAnsi="Times New Roman" w:cs="Times New Roman"/>
-                <w:b/>
-                <w:bCs/>
-                <w:sz w:val="18"/>
-                <w:szCs w:val="18"/>
-                <w:u w:val="single"/>
-              </w:rPr>
-              <w:t>}</w:t>
+              <w:t>${date_of_birth}</w:t>
             </w:r>
           </w:p>
         </w:tc>
@@ -2055,6 +1657,35 @@
               <w:jc w:val="both"/>
               <w:rPr>
                 <w:rFonts w:ascii="Times New Roman" w:eastAsia="Times New Roman" w:hAnsi="Times New Roman" w:cs="Times New Roman"/>
+                <w:sz w:val="18"/>
+                <w:szCs w:val="18"/>
+                <w:u w:val="single"/>
+              </w:rPr>
+            </w:pPr>
+            <w:r>
+              <w:rPr>
+                <w:rFonts w:ascii="Times New Roman" w:eastAsia="Times New Roman" w:hAnsi="Times New Roman" w:cs="Times New Roman"/>
+                <w:sz w:val="18"/>
+                <w:szCs w:val="18"/>
+                <w:u w:val="single"/>
+              </w:rPr>
+              <w:t>${philhealth_no}</w:t>
+            </w:r>
+          </w:p>
+        </w:tc>
+        <w:tc>
+          <w:tcPr>
+            <w:tcW w:w="1980" w:type="dxa"/>
+            <w:tcBorders>
+              <w:right w:val="single" w:sz="4" w:space="0" w:color="auto"/>
+            </w:tcBorders>
+          </w:tcPr>
+          <w:p>
+            <w:pPr>
+              <w:spacing w:after="0"/>
+              <w:jc w:val="both"/>
+              <w:rPr>
+                <w:rFonts w:ascii="Times New Roman" w:eastAsia="Times New Roman" w:hAnsi="Times New Roman" w:cs="Times New Roman"/>
                 <w:b/>
                 <w:bCs/>
                 <w:sz w:val="18"/>
@@ -2062,48 +1693,13 @@
                 <w:u w:val="single"/>
               </w:rPr>
             </w:pPr>
-            <w:r>
-              <w:rPr>
-                <w:rFonts w:ascii="Times New Roman" w:eastAsia="Times New Roman" w:hAnsi="Times New Roman" w:cs="Times New Roman"/>
-                <w:b/>
-                <w:bCs/>
-                <w:sz w:val="18"/>
-                <w:szCs w:val="18"/>
-                <w:u w:val="single"/>
-              </w:rPr>
-              <w:t>${</w:t>
-            </w:r>
-            <w:proofErr w:type="spellStart"/>
-            <w:r>
-              <w:rPr>
-                <w:rFonts w:ascii="Times New Roman" w:eastAsia="Times New Roman" w:hAnsi="Times New Roman" w:cs="Times New Roman"/>
-                <w:b/>
-                <w:bCs/>
-                <w:sz w:val="18"/>
-                <w:szCs w:val="18"/>
-                <w:u w:val="single"/>
-              </w:rPr>
-              <w:t>philhealth_no</w:t>
-            </w:r>
-            <w:proofErr w:type="spellEnd"/>
-            <w:r>
-              <w:rPr>
-                <w:rFonts w:ascii="Times New Roman" w:eastAsia="Times New Roman" w:hAnsi="Times New Roman" w:cs="Times New Roman"/>
-                <w:b/>
-                <w:bCs/>
-                <w:sz w:val="18"/>
-                <w:szCs w:val="18"/>
-                <w:u w:val="single"/>
-              </w:rPr>
-              <w:t>}</w:t>
-            </w:r>
-          </w:p>
-        </w:tc>
-        <w:tc>
-          <w:tcPr>
-            <w:tcW w:w="1980" w:type="dxa"/>
-            <w:tcBorders>
-              <w:right w:val="single" w:sz="4" w:space="0" w:color="auto"/>
+          </w:p>
+        </w:tc>
+        <w:tc>
+          <w:tcPr>
+            <w:tcW w:w="2633" w:type="dxa"/>
+            <w:tcBorders>
+              <w:left w:val="single" w:sz="4" w:space="0" w:color="auto"/>
             </w:tcBorders>
           </w:tcPr>
           <w:p>
@@ -2112,30 +1708,6 @@
               <w:jc w:val="both"/>
               <w:rPr>
                 <w:rFonts w:ascii="Times New Roman" w:eastAsia="Times New Roman" w:hAnsi="Times New Roman" w:cs="Times New Roman"/>
-                <w:b/>
-                <w:bCs/>
-                <w:sz w:val="18"/>
-                <w:szCs w:val="18"/>
-                <w:u w:val="single"/>
-              </w:rPr>
-            </w:pPr>
-          </w:p>
-        </w:tc>
-        <w:tc>
-          <w:tcPr>
-            <w:tcW w:w="2633" w:type="dxa"/>
-            <w:tcBorders>
-              <w:left w:val="single" w:sz="4" w:space="0" w:color="auto"/>
-            </w:tcBorders>
-          </w:tcPr>
-          <w:p>
-            <w:pPr>
-              <w:spacing w:after="0"/>
-              <w:jc w:val="both"/>
-              <w:rPr>
-                <w:rFonts w:ascii="Times New Roman" w:eastAsia="Times New Roman" w:hAnsi="Times New Roman" w:cs="Times New Roman"/>
-                <w:b/>
-                <w:bCs/>
                 <w:sz w:val="18"/>
                 <w:szCs w:val="18"/>
                 <w:u w:val="single"/>
@@ -2201,6 +1773,35 @@
               <w:jc w:val="both"/>
               <w:rPr>
                 <w:rFonts w:ascii="Times New Roman" w:eastAsia="Times New Roman" w:hAnsi="Times New Roman" w:cs="Times New Roman"/>
+                <w:sz w:val="18"/>
+                <w:szCs w:val="18"/>
+                <w:u w:val="single"/>
+              </w:rPr>
+            </w:pPr>
+            <w:r>
+              <w:rPr>
+                <w:rFonts w:ascii="Times New Roman" w:eastAsia="Times New Roman" w:hAnsi="Times New Roman" w:cs="Times New Roman"/>
+                <w:sz w:val="18"/>
+                <w:szCs w:val="18"/>
+                <w:u w:val="single"/>
+              </w:rPr>
+              <w:t>${sss_no}</w:t>
+            </w:r>
+          </w:p>
+        </w:tc>
+        <w:tc>
+          <w:tcPr>
+            <w:tcW w:w="1980" w:type="dxa"/>
+            <w:tcBorders>
+              <w:right w:val="single" w:sz="4" w:space="0" w:color="auto"/>
+            </w:tcBorders>
+          </w:tcPr>
+          <w:p>
+            <w:pPr>
+              <w:spacing w:after="0"/>
+              <w:jc w:val="both"/>
+              <w:rPr>
+                <w:rFonts w:ascii="Times New Roman" w:eastAsia="Times New Roman" w:hAnsi="Times New Roman" w:cs="Times New Roman"/>
                 <w:b/>
                 <w:bCs/>
                 <w:sz w:val="18"/>
@@ -2211,124 +1812,39 @@
             <w:r>
               <w:rPr>
                 <w:rFonts w:ascii="Times New Roman" w:eastAsia="Times New Roman" w:hAnsi="Times New Roman" w:cs="Times New Roman"/>
-                <w:b/>
-                <w:bCs/>
+                <w:sz w:val="18"/>
+                <w:szCs w:val="18"/>
+              </w:rPr>
+              <w:t xml:space="preserve">20. MOBILE NO. </w:t>
+            </w:r>
+          </w:p>
+        </w:tc>
+        <w:tc>
+          <w:tcPr>
+            <w:tcW w:w="2633" w:type="dxa"/>
+            <w:tcBorders>
+              <w:left w:val="single" w:sz="4" w:space="0" w:color="auto"/>
+            </w:tcBorders>
+          </w:tcPr>
+          <w:p>
+            <w:pPr>
+              <w:spacing w:after="0"/>
+              <w:jc w:val="both"/>
+              <w:rPr>
+                <w:rFonts w:ascii="Times New Roman" w:eastAsia="Times New Roman" w:hAnsi="Times New Roman" w:cs="Times New Roman"/>
                 <w:sz w:val="18"/>
                 <w:szCs w:val="18"/>
                 <w:u w:val="single"/>
               </w:rPr>
-              <w:t>${</w:t>
-            </w:r>
-            <w:proofErr w:type="spellStart"/>
-            <w:r>
-              <w:rPr>
-                <w:rFonts w:ascii="Times New Roman" w:eastAsia="Times New Roman" w:hAnsi="Times New Roman" w:cs="Times New Roman"/>
-                <w:b/>
-                <w:bCs/>
+            </w:pPr>
+            <w:r>
+              <w:rPr>
+                <w:rFonts w:ascii="Times New Roman" w:eastAsia="Times New Roman" w:hAnsi="Times New Roman" w:cs="Times New Roman"/>
                 <w:sz w:val="18"/>
                 <w:szCs w:val="18"/>
                 <w:u w:val="single"/>
               </w:rPr>
-              <w:t>sss_no</w:t>
-            </w:r>
-            <w:proofErr w:type="spellEnd"/>
-            <w:r>
-              <w:rPr>
-                <w:rFonts w:ascii="Times New Roman" w:eastAsia="Times New Roman" w:hAnsi="Times New Roman" w:cs="Times New Roman"/>
-                <w:b/>
-                <w:bCs/>
-                <w:sz w:val="18"/>
-                <w:szCs w:val="18"/>
-                <w:u w:val="single"/>
-              </w:rPr>
-              <w:t>}</w:t>
-            </w:r>
-          </w:p>
-        </w:tc>
-        <w:tc>
-          <w:tcPr>
-            <w:tcW w:w="1980" w:type="dxa"/>
-            <w:tcBorders>
-              <w:right w:val="single" w:sz="4" w:space="0" w:color="auto"/>
-            </w:tcBorders>
-          </w:tcPr>
-          <w:p>
-            <w:pPr>
-              <w:spacing w:after="0"/>
-              <w:jc w:val="both"/>
-              <w:rPr>
-                <w:rFonts w:ascii="Times New Roman" w:eastAsia="Times New Roman" w:hAnsi="Times New Roman" w:cs="Times New Roman"/>
-                <w:b/>
-                <w:bCs/>
-                <w:sz w:val="18"/>
-                <w:szCs w:val="18"/>
-                <w:u w:val="single"/>
-              </w:rPr>
-            </w:pPr>
-            <w:r>
-              <w:rPr>
-                <w:rFonts w:ascii="Times New Roman" w:eastAsia="Times New Roman" w:hAnsi="Times New Roman" w:cs="Times New Roman"/>
-                <w:sz w:val="18"/>
-                <w:szCs w:val="18"/>
-              </w:rPr>
-              <w:t xml:space="preserve">20. MOBILE NO. </w:t>
-            </w:r>
-          </w:p>
-        </w:tc>
-        <w:tc>
-          <w:tcPr>
-            <w:tcW w:w="2633" w:type="dxa"/>
-            <w:tcBorders>
-              <w:left w:val="single" w:sz="4" w:space="0" w:color="auto"/>
-            </w:tcBorders>
-          </w:tcPr>
-          <w:p>
-            <w:pPr>
-              <w:spacing w:after="0"/>
-              <w:jc w:val="both"/>
-              <w:rPr>
-                <w:rFonts w:ascii="Times New Roman" w:eastAsia="Times New Roman" w:hAnsi="Times New Roman" w:cs="Times New Roman"/>
-                <w:b/>
-                <w:bCs/>
-                <w:sz w:val="18"/>
-                <w:szCs w:val="18"/>
-                <w:u w:val="single"/>
-              </w:rPr>
-            </w:pPr>
-            <w:r>
-              <w:rPr>
-                <w:rFonts w:ascii="Times New Roman" w:eastAsia="Times New Roman" w:hAnsi="Times New Roman" w:cs="Times New Roman"/>
-                <w:b/>
-                <w:bCs/>
-                <w:sz w:val="18"/>
-                <w:szCs w:val="18"/>
-                <w:u w:val="single"/>
-              </w:rPr>
-              <w:t>${</w:t>
-            </w:r>
-            <w:proofErr w:type="spellStart"/>
-            <w:r>
-              <w:rPr>
-                <w:rFonts w:ascii="Times New Roman" w:eastAsia="Times New Roman" w:hAnsi="Times New Roman" w:cs="Times New Roman"/>
-                <w:b/>
-                <w:bCs/>
-                <w:sz w:val="18"/>
-                <w:szCs w:val="18"/>
-                <w:u w:val="single"/>
-              </w:rPr>
-              <w:t>mobile_no</w:t>
-            </w:r>
-            <w:proofErr w:type="spellEnd"/>
-            <w:r>
-              <w:rPr>
-                <w:rFonts w:ascii="Times New Roman" w:eastAsia="Times New Roman" w:hAnsi="Times New Roman" w:cs="Times New Roman"/>
-                <w:b/>
-                <w:bCs/>
-                <w:sz w:val="18"/>
-                <w:szCs w:val="18"/>
-                <w:u w:val="single"/>
-              </w:rPr>
-              <w:t>}</w:t>
+              <w:t>${mobile_no}</w:t>
             </w:r>
           </w:p>
         </w:tc>
@@ -2390,6 +1906,35 @@
               <w:jc w:val="both"/>
               <w:rPr>
                 <w:rFonts w:ascii="Times New Roman" w:eastAsia="Times New Roman" w:hAnsi="Times New Roman" w:cs="Times New Roman"/>
+                <w:sz w:val="18"/>
+                <w:szCs w:val="18"/>
+                <w:u w:val="single"/>
+              </w:rPr>
+            </w:pPr>
+            <w:r>
+              <w:rPr>
+                <w:rFonts w:ascii="Times New Roman" w:eastAsia="Times New Roman" w:hAnsi="Times New Roman" w:cs="Times New Roman"/>
+                <w:sz w:val="18"/>
+                <w:szCs w:val="18"/>
+                <w:u w:val="single"/>
+              </w:rPr>
+              <w:t>${tin}</w:t>
+            </w:r>
+          </w:p>
+        </w:tc>
+        <w:tc>
+          <w:tcPr>
+            <w:tcW w:w="1980" w:type="dxa"/>
+            <w:tcBorders>
+              <w:right w:val="single" w:sz="4" w:space="0" w:color="auto"/>
+            </w:tcBorders>
+          </w:tcPr>
+          <w:p>
+            <w:pPr>
+              <w:spacing w:after="0"/>
+              <w:jc w:val="both"/>
+              <w:rPr>
+                <w:rFonts w:ascii="Times New Roman" w:eastAsia="Times New Roman" w:hAnsi="Times New Roman" w:cs="Times New Roman"/>
                 <w:b/>
                 <w:bCs/>
                 <w:sz w:val="18"/>
@@ -2400,100 +1945,39 @@
             <w:r>
               <w:rPr>
                 <w:rFonts w:ascii="Times New Roman" w:eastAsia="Times New Roman" w:hAnsi="Times New Roman" w:cs="Times New Roman"/>
-                <w:b/>
-                <w:bCs/>
+                <w:sz w:val="18"/>
+                <w:szCs w:val="18"/>
+              </w:rPr>
+              <w:t>21. EMAIL ADDRESS:</w:t>
+            </w:r>
+          </w:p>
+        </w:tc>
+        <w:tc>
+          <w:tcPr>
+            <w:tcW w:w="2633" w:type="dxa"/>
+            <w:tcBorders>
+              <w:left w:val="single" w:sz="4" w:space="0" w:color="auto"/>
+            </w:tcBorders>
+          </w:tcPr>
+          <w:p>
+            <w:pPr>
+              <w:spacing w:after="0"/>
+              <w:jc w:val="both"/>
+              <w:rPr>
+                <w:rFonts w:ascii="Times New Roman" w:eastAsia="Times New Roman" w:hAnsi="Times New Roman" w:cs="Times New Roman"/>
                 <w:sz w:val="18"/>
                 <w:szCs w:val="18"/>
                 <w:u w:val="single"/>
               </w:rPr>
-              <w:t>${tin}</w:t>
-            </w:r>
-          </w:p>
-        </w:tc>
-        <w:tc>
-          <w:tcPr>
-            <w:tcW w:w="1980" w:type="dxa"/>
-            <w:tcBorders>
-              <w:right w:val="single" w:sz="4" w:space="0" w:color="auto"/>
-            </w:tcBorders>
-          </w:tcPr>
-          <w:p>
-            <w:pPr>
-              <w:spacing w:after="0"/>
-              <w:jc w:val="both"/>
-              <w:rPr>
-                <w:rFonts w:ascii="Times New Roman" w:eastAsia="Times New Roman" w:hAnsi="Times New Roman" w:cs="Times New Roman"/>
-                <w:b/>
-                <w:bCs/>
+            </w:pPr>
+            <w:r>
+              <w:rPr>
+                <w:rFonts w:ascii="Times New Roman" w:eastAsia="Times New Roman" w:hAnsi="Times New Roman" w:cs="Times New Roman"/>
                 <w:sz w:val="18"/>
                 <w:szCs w:val="18"/>
                 <w:u w:val="single"/>
               </w:rPr>
-            </w:pPr>
-            <w:r>
-              <w:rPr>
-                <w:rFonts w:ascii="Times New Roman" w:eastAsia="Times New Roman" w:hAnsi="Times New Roman" w:cs="Times New Roman"/>
-                <w:sz w:val="18"/>
-                <w:szCs w:val="18"/>
-              </w:rPr>
-              <w:t>21. EMAIL ADDRESS:</w:t>
-            </w:r>
-          </w:p>
-        </w:tc>
-        <w:tc>
-          <w:tcPr>
-            <w:tcW w:w="2633" w:type="dxa"/>
-            <w:tcBorders>
-              <w:left w:val="single" w:sz="4" w:space="0" w:color="auto"/>
-            </w:tcBorders>
-          </w:tcPr>
-          <w:p>
-            <w:pPr>
-              <w:spacing w:after="0"/>
-              <w:jc w:val="both"/>
-              <w:rPr>
-                <w:rFonts w:ascii="Times New Roman" w:eastAsia="Times New Roman" w:hAnsi="Times New Roman" w:cs="Times New Roman"/>
-                <w:b/>
-                <w:bCs/>
-                <w:sz w:val="18"/>
-                <w:szCs w:val="18"/>
-                <w:u w:val="single"/>
-              </w:rPr>
-            </w:pPr>
-            <w:r>
-              <w:rPr>
-                <w:rFonts w:ascii="Times New Roman" w:eastAsia="Times New Roman" w:hAnsi="Times New Roman" w:cs="Times New Roman"/>
-                <w:b/>
-                <w:bCs/>
-                <w:sz w:val="18"/>
-                <w:szCs w:val="18"/>
-                <w:u w:val="single"/>
-              </w:rPr>
-              <w:t>${</w:t>
-            </w:r>
-            <w:proofErr w:type="spellStart"/>
-            <w:r>
-              <w:rPr>
-                <w:rFonts w:ascii="Times New Roman" w:eastAsia="Times New Roman" w:hAnsi="Times New Roman" w:cs="Times New Roman"/>
-                <w:b/>
-                <w:bCs/>
-                <w:sz w:val="18"/>
-                <w:szCs w:val="18"/>
-                <w:u w:val="single"/>
-              </w:rPr>
-              <w:t>founder_email</w:t>
-            </w:r>
-            <w:proofErr w:type="spellEnd"/>
-            <w:r>
-              <w:rPr>
-                <w:rFonts w:ascii="Times New Roman" w:eastAsia="Times New Roman" w:hAnsi="Times New Roman" w:cs="Times New Roman"/>
-                <w:b/>
-                <w:bCs/>
-                <w:sz w:val="18"/>
-                <w:szCs w:val="18"/>
-                <w:u w:val="single"/>
-              </w:rPr>
-              <w:t>}</w:t>
+              <w:t>${founder_email}</w:t>
             </w:r>
           </w:p>
         </w:tc>
@@ -2583,8 +2067,6 @@
               <w:jc w:val="both"/>
               <w:rPr>
                 <w:rFonts w:ascii="Times New Roman" w:eastAsia="Times New Roman" w:hAnsi="Times New Roman" w:cs="Times New Roman"/>
-                <w:b/>
-                <w:bCs/>
                 <w:sz w:val="18"/>
                 <w:szCs w:val="18"/>
                 <w:u w:val="single"/>
@@ -2593,37 +2075,11 @@
             <w:r>
               <w:rPr>
                 <w:rFonts w:ascii="Times New Roman" w:eastAsia="Times New Roman" w:hAnsi="Times New Roman" w:cs="Times New Roman"/>
-                <w:b/>
-                <w:bCs/>
                 <w:sz w:val="18"/>
                 <w:szCs w:val="18"/>
                 <w:u w:val="single"/>
               </w:rPr>
-              <w:t>${</w:t>
-            </w:r>
-            <w:proofErr w:type="spellStart"/>
-            <w:r>
-              <w:rPr>
-                <w:rFonts w:ascii="Times New Roman" w:eastAsia="Times New Roman" w:hAnsi="Times New Roman" w:cs="Times New Roman"/>
-                <w:b/>
-                <w:bCs/>
-                <w:sz w:val="18"/>
-                <w:szCs w:val="18"/>
-                <w:u w:val="single"/>
-              </w:rPr>
-              <w:t>residential_address</w:t>
-            </w:r>
-            <w:proofErr w:type="spellEnd"/>
-            <w:r>
-              <w:rPr>
-                <w:rFonts w:ascii="Times New Roman" w:eastAsia="Times New Roman" w:hAnsi="Times New Roman" w:cs="Times New Roman"/>
-                <w:b/>
-                <w:bCs/>
-                <w:sz w:val="18"/>
-                <w:szCs w:val="18"/>
-                <w:u w:val="single"/>
-              </w:rPr>
-              <w:t>}</w:t>
+              <w:t>${residential_address}</w:t>
             </w:r>
           </w:p>
         </w:tc>
@@ -2685,8 +2141,6 @@
               <w:jc w:val="both"/>
               <w:rPr>
                 <w:rFonts w:ascii="Times New Roman" w:eastAsia="Times New Roman" w:hAnsi="Times New Roman" w:cs="Times New Roman"/>
-                <w:b/>
-                <w:bCs/>
                 <w:sz w:val="18"/>
                 <w:szCs w:val="18"/>
                 <w:u w:val="single"/>
@@ -2695,37 +2149,11 @@
             <w:r>
               <w:rPr>
                 <w:rFonts w:ascii="Times New Roman" w:eastAsia="Times New Roman" w:hAnsi="Times New Roman" w:cs="Times New Roman"/>
-                <w:b/>
-                <w:bCs/>
                 <w:sz w:val="18"/>
                 <w:szCs w:val="18"/>
                 <w:u w:val="single"/>
               </w:rPr>
-              <w:t>${</w:t>
-            </w:r>
-            <w:proofErr w:type="spellStart"/>
-            <w:r>
-              <w:rPr>
-                <w:rFonts w:ascii="Times New Roman" w:eastAsia="Times New Roman" w:hAnsi="Times New Roman" w:cs="Times New Roman"/>
-                <w:b/>
-                <w:bCs/>
-                <w:sz w:val="18"/>
-                <w:szCs w:val="18"/>
-                <w:u w:val="single"/>
-              </w:rPr>
-              <w:t>permanent_address</w:t>
-            </w:r>
-            <w:proofErr w:type="spellEnd"/>
-            <w:r>
-              <w:rPr>
-                <w:rFonts w:ascii="Times New Roman" w:eastAsia="Times New Roman" w:hAnsi="Times New Roman" w:cs="Times New Roman"/>
-                <w:b/>
-                <w:bCs/>
-                <w:sz w:val="18"/>
-                <w:szCs w:val="18"/>
-                <w:u w:val="single"/>
-              </w:rPr>
-              <w:t>}</w:t>
+              <w:t>${permanent_address}</w:t>
             </w:r>
           </w:p>
         </w:tc>
@@ -3002,8 +2430,6 @@
               <w:spacing w:after="0"/>
               <w:rPr>
                 <w:rFonts w:ascii="Times New Roman" w:eastAsia="Times New Roman" w:hAnsi="Times New Roman" w:cs="Times New Roman"/>
-                <w:b/>
-                <w:bCs/>
                 <w:sz w:val="14"/>
                 <w:szCs w:val="14"/>
               </w:rPr>
@@ -3011,34 +2437,10 @@
             <w:r>
               <w:rPr>
                 <w:rFonts w:ascii="Times New Roman" w:eastAsia="Times New Roman" w:hAnsi="Times New Roman" w:cs="Times New Roman"/>
-                <w:b/>
-                <w:bCs/>
                 <w:sz w:val="14"/>
                 <w:szCs w:val="14"/>
               </w:rPr>
-              <w:t>${</w:t>
-            </w:r>
-            <w:proofErr w:type="spellStart"/>
-            <w:r>
-              <w:rPr>
-                <w:rFonts w:ascii="Times New Roman" w:eastAsia="Times New Roman" w:hAnsi="Times New Roman" w:cs="Times New Roman"/>
-                <w:b/>
-                <w:bCs/>
-                <w:sz w:val="14"/>
-                <w:szCs w:val="14"/>
-              </w:rPr>
-              <w:t>secondary_school</w:t>
-            </w:r>
-            <w:proofErr w:type="spellEnd"/>
-            <w:r>
-              <w:rPr>
-                <w:rFonts w:ascii="Times New Roman" w:eastAsia="Times New Roman" w:hAnsi="Times New Roman" w:cs="Times New Roman"/>
-                <w:b/>
-                <w:bCs/>
-                <w:sz w:val="14"/>
-                <w:szCs w:val="14"/>
-              </w:rPr>
-              <w:t>}</w:t>
+              <w:t>${secondary_school}</w:t>
             </w:r>
           </w:p>
         </w:tc>
@@ -3064,34 +2466,10 @@
             <w:r>
               <w:rPr>
                 <w:rFonts w:ascii="Times New Roman" w:eastAsia="Times New Roman" w:hAnsi="Times New Roman" w:cs="Times New Roman"/>
-                <w:b/>
-                <w:bCs/>
                 <w:sz w:val="14"/>
                 <w:szCs w:val="14"/>
               </w:rPr>
-              <w:t>${</w:t>
-            </w:r>
-            <w:proofErr w:type="spellStart"/>
-            <w:r>
-              <w:rPr>
-                <w:rFonts w:ascii="Times New Roman" w:eastAsia="Times New Roman" w:hAnsi="Times New Roman" w:cs="Times New Roman"/>
-                <w:b/>
-                <w:bCs/>
-                <w:sz w:val="14"/>
-                <w:szCs w:val="14"/>
-              </w:rPr>
-              <w:t>secondary_degree_course</w:t>
-            </w:r>
-            <w:proofErr w:type="spellEnd"/>
-            <w:r>
-              <w:rPr>
-                <w:rFonts w:ascii="Times New Roman" w:eastAsia="Times New Roman" w:hAnsi="Times New Roman" w:cs="Times New Roman"/>
-                <w:b/>
-                <w:bCs/>
-                <w:sz w:val="14"/>
-                <w:szCs w:val="14"/>
-              </w:rPr>
-              <w:t>}</w:t>
+              <w:t>${secondary_degree_course}</w:t>
             </w:r>
           </w:p>
         </w:tc>
@@ -3119,23 +2497,7 @@
                 <w:rFonts w:ascii="Times New Roman" w:eastAsia="Times New Roman" w:hAnsi="Times New Roman" w:cs="Times New Roman"/>
                 <w:sz w:val="14"/>
               </w:rPr>
-              <w:t>${</w:t>
-            </w:r>
-            <w:proofErr w:type="spellStart"/>
-            <w:r>
-              <w:rPr>
-                <w:rFonts w:ascii="Times New Roman" w:eastAsia="Times New Roman" w:hAnsi="Times New Roman" w:cs="Times New Roman"/>
-                <w:sz w:val="14"/>
-              </w:rPr>
-              <w:t>secondary_highest_level_unit</w:t>
-            </w:r>
-            <w:proofErr w:type="spellEnd"/>
-            <w:r>
-              <w:rPr>
-                <w:rFonts w:ascii="Times New Roman" w:eastAsia="Times New Roman" w:hAnsi="Times New Roman" w:cs="Times New Roman"/>
-                <w:sz w:val="14"/>
-              </w:rPr>
-              <w:t>}</w:t>
+              <w:t>${secondary_highest_level_unit}</w:t>
             </w:r>
           </w:p>
         </w:tc>
@@ -3163,23 +2525,7 @@
                 <w:rFonts w:ascii="Times New Roman" w:eastAsia="Times New Roman" w:hAnsi="Times New Roman" w:cs="Times New Roman"/>
                 <w:sz w:val="14"/>
               </w:rPr>
-              <w:t>${</w:t>
-            </w:r>
-            <w:proofErr w:type="spellStart"/>
-            <w:r>
-              <w:rPr>
-                <w:rFonts w:ascii="Times New Roman" w:eastAsia="Times New Roman" w:hAnsi="Times New Roman" w:cs="Times New Roman"/>
-                <w:sz w:val="14"/>
-              </w:rPr>
-              <w:t>secondary_year_graduated</w:t>
-            </w:r>
-            <w:proofErr w:type="spellEnd"/>
-            <w:r>
-              <w:rPr>
-                <w:rFonts w:ascii="Times New Roman" w:eastAsia="Times New Roman" w:hAnsi="Times New Roman" w:cs="Times New Roman"/>
-                <w:sz w:val="14"/>
-              </w:rPr>
-              <w:t>}</w:t>
+              <w:t>${secondary_year_graduated}</w:t>
             </w:r>
           </w:p>
         </w:tc>
@@ -3233,8 +2579,6 @@
               <w:spacing w:after="0"/>
               <w:rPr>
                 <w:rFonts w:ascii="Times New Roman" w:eastAsia="Times New Roman" w:hAnsi="Times New Roman" w:cs="Times New Roman"/>
-                <w:b/>
-                <w:bCs/>
                 <w:sz w:val="14"/>
                 <w:szCs w:val="14"/>
               </w:rPr>
@@ -3242,34 +2586,10 @@
             <w:r>
               <w:rPr>
                 <w:rFonts w:ascii="Times New Roman" w:eastAsia="Times New Roman" w:hAnsi="Times New Roman" w:cs="Times New Roman"/>
-                <w:b/>
-                <w:bCs/>
                 <w:sz w:val="14"/>
                 <w:szCs w:val="14"/>
               </w:rPr>
-              <w:t>${</w:t>
-            </w:r>
-            <w:proofErr w:type="spellStart"/>
-            <w:r>
-              <w:rPr>
-                <w:rFonts w:ascii="Times New Roman" w:eastAsia="Times New Roman" w:hAnsi="Times New Roman" w:cs="Times New Roman"/>
-                <w:b/>
-                <w:bCs/>
-                <w:sz w:val="14"/>
-                <w:szCs w:val="14"/>
-              </w:rPr>
-              <w:t>vocational_school</w:t>
-            </w:r>
-            <w:proofErr w:type="spellEnd"/>
-            <w:r>
-              <w:rPr>
-                <w:rFonts w:ascii="Times New Roman" w:eastAsia="Times New Roman" w:hAnsi="Times New Roman" w:cs="Times New Roman"/>
-                <w:b/>
-                <w:bCs/>
-                <w:sz w:val="14"/>
-                <w:szCs w:val="14"/>
-              </w:rPr>
-              <w:t>}</w:t>
+              <w:t>${vocational_school}</w:t>
             </w:r>
           </w:p>
         </w:tc>
@@ -3295,34 +2615,10 @@
             <w:r>
               <w:rPr>
                 <w:rFonts w:ascii="Times New Roman" w:eastAsia="Times New Roman" w:hAnsi="Times New Roman" w:cs="Times New Roman"/>
-                <w:b/>
-                <w:bCs/>
                 <w:sz w:val="14"/>
                 <w:szCs w:val="14"/>
               </w:rPr>
-              <w:t>${</w:t>
-            </w:r>
-            <w:proofErr w:type="spellStart"/>
-            <w:r>
-              <w:rPr>
-                <w:rFonts w:ascii="Times New Roman" w:eastAsia="Times New Roman" w:hAnsi="Times New Roman" w:cs="Times New Roman"/>
-                <w:b/>
-                <w:bCs/>
-                <w:sz w:val="14"/>
-                <w:szCs w:val="14"/>
-              </w:rPr>
-              <w:t>vocational_degree_course</w:t>
-            </w:r>
-            <w:proofErr w:type="spellEnd"/>
-            <w:r>
-              <w:rPr>
-                <w:rFonts w:ascii="Times New Roman" w:eastAsia="Times New Roman" w:hAnsi="Times New Roman" w:cs="Times New Roman"/>
-                <w:b/>
-                <w:bCs/>
-                <w:sz w:val="14"/>
-                <w:szCs w:val="14"/>
-              </w:rPr>
-              <w:t>}</w:t>
+              <w:t>${vocational_degree_course}</w:t>
             </w:r>
           </w:p>
         </w:tc>
@@ -3350,23 +2646,7 @@
                 <w:rFonts w:ascii="Times New Roman" w:eastAsia="Times New Roman" w:hAnsi="Times New Roman" w:cs="Times New Roman"/>
                 <w:sz w:val="14"/>
               </w:rPr>
-              <w:t>${</w:t>
-            </w:r>
-            <w:proofErr w:type="spellStart"/>
-            <w:r>
-              <w:rPr>
-                <w:rFonts w:ascii="Times New Roman" w:eastAsia="Times New Roman" w:hAnsi="Times New Roman" w:cs="Times New Roman"/>
-                <w:sz w:val="14"/>
-              </w:rPr>
-              <w:t>vocational_highest_level_unit</w:t>
-            </w:r>
-            <w:proofErr w:type="spellEnd"/>
-            <w:r>
-              <w:rPr>
-                <w:rFonts w:ascii="Times New Roman" w:eastAsia="Times New Roman" w:hAnsi="Times New Roman" w:cs="Times New Roman"/>
-                <w:sz w:val="14"/>
-              </w:rPr>
-              <w:t>}</w:t>
+              <w:t>${vocational_highest_level_unit}</w:t>
             </w:r>
           </w:p>
         </w:tc>
@@ -3394,23 +2674,7 @@
                 <w:rFonts w:ascii="Times New Roman" w:eastAsia="Times New Roman" w:hAnsi="Times New Roman" w:cs="Times New Roman"/>
                 <w:sz w:val="14"/>
               </w:rPr>
-              <w:t>${</w:t>
-            </w:r>
-            <w:proofErr w:type="spellStart"/>
-            <w:r>
-              <w:rPr>
-                <w:rFonts w:ascii="Times New Roman" w:eastAsia="Times New Roman" w:hAnsi="Times New Roman" w:cs="Times New Roman"/>
-                <w:sz w:val="14"/>
-              </w:rPr>
-              <w:t>vocational_year_graduated</w:t>
-            </w:r>
-            <w:proofErr w:type="spellEnd"/>
-            <w:r>
-              <w:rPr>
-                <w:rFonts w:ascii="Times New Roman" w:eastAsia="Times New Roman" w:hAnsi="Times New Roman" w:cs="Times New Roman"/>
-                <w:sz w:val="14"/>
-              </w:rPr>
-              <w:t>}</w:t>
+              <w:t>${vocational_year_graduated}</w:t>
             </w:r>
           </w:p>
         </w:tc>
@@ -3464,8 +2728,6 @@
               <w:spacing w:after="0"/>
               <w:rPr>
                 <w:rFonts w:ascii="Times New Roman" w:eastAsia="Times New Roman" w:hAnsi="Times New Roman" w:cs="Times New Roman"/>
-                <w:b/>
-                <w:bCs/>
                 <w:sz w:val="14"/>
                 <w:szCs w:val="14"/>
               </w:rPr>
@@ -3473,34 +2735,10 @@
             <w:r>
               <w:rPr>
                 <w:rFonts w:ascii="Times New Roman" w:eastAsia="Times New Roman" w:hAnsi="Times New Roman" w:cs="Times New Roman"/>
-                <w:b/>
-                <w:bCs/>
                 <w:sz w:val="14"/>
                 <w:szCs w:val="14"/>
               </w:rPr>
-              <w:t>${</w:t>
-            </w:r>
-            <w:proofErr w:type="spellStart"/>
-            <w:r>
-              <w:rPr>
-                <w:rFonts w:ascii="Times New Roman" w:eastAsia="Times New Roman" w:hAnsi="Times New Roman" w:cs="Times New Roman"/>
-                <w:b/>
-                <w:bCs/>
-                <w:sz w:val="14"/>
-                <w:szCs w:val="14"/>
-              </w:rPr>
-              <w:t>college_school</w:t>
-            </w:r>
-            <w:proofErr w:type="spellEnd"/>
-            <w:r>
-              <w:rPr>
-                <w:rFonts w:ascii="Times New Roman" w:eastAsia="Times New Roman" w:hAnsi="Times New Roman" w:cs="Times New Roman"/>
-                <w:b/>
-                <w:bCs/>
-                <w:sz w:val="14"/>
-                <w:szCs w:val="14"/>
-              </w:rPr>
-              <w:t>}</w:t>
+              <w:t>${college_school}</w:t>
             </w:r>
           </w:p>
         </w:tc>
@@ -3526,34 +2764,10 @@
             <w:r>
               <w:rPr>
                 <w:rFonts w:ascii="Times New Roman" w:eastAsia="Times New Roman" w:hAnsi="Times New Roman" w:cs="Times New Roman"/>
-                <w:b/>
-                <w:bCs/>
                 <w:sz w:val="14"/>
                 <w:szCs w:val="14"/>
               </w:rPr>
-              <w:t>${</w:t>
-            </w:r>
-            <w:proofErr w:type="spellStart"/>
-            <w:r>
-              <w:rPr>
-                <w:rFonts w:ascii="Times New Roman" w:eastAsia="Times New Roman" w:hAnsi="Times New Roman" w:cs="Times New Roman"/>
-                <w:b/>
-                <w:bCs/>
-                <w:sz w:val="14"/>
-                <w:szCs w:val="14"/>
-              </w:rPr>
-              <w:t>college_degree_course</w:t>
-            </w:r>
-            <w:proofErr w:type="spellEnd"/>
-            <w:r>
-              <w:rPr>
-                <w:rFonts w:ascii="Times New Roman" w:eastAsia="Times New Roman" w:hAnsi="Times New Roman" w:cs="Times New Roman"/>
-                <w:b/>
-                <w:bCs/>
-                <w:sz w:val="14"/>
-                <w:szCs w:val="14"/>
-              </w:rPr>
-              <w:t>}</w:t>
+              <w:t>${college_degree_course}</w:t>
             </w:r>
           </w:p>
         </w:tc>
@@ -3581,23 +2795,7 @@
                 <w:rFonts w:ascii="Times New Roman" w:eastAsia="Times New Roman" w:hAnsi="Times New Roman" w:cs="Times New Roman"/>
                 <w:sz w:val="14"/>
               </w:rPr>
-              <w:t>${</w:t>
-            </w:r>
-            <w:proofErr w:type="spellStart"/>
-            <w:r>
-              <w:rPr>
-                <w:rFonts w:ascii="Times New Roman" w:eastAsia="Times New Roman" w:hAnsi="Times New Roman" w:cs="Times New Roman"/>
-                <w:sz w:val="14"/>
-              </w:rPr>
-              <w:t>college_highest_level_unit</w:t>
-            </w:r>
-            <w:proofErr w:type="spellEnd"/>
-            <w:r>
-              <w:rPr>
-                <w:rFonts w:ascii="Times New Roman" w:eastAsia="Times New Roman" w:hAnsi="Times New Roman" w:cs="Times New Roman"/>
-                <w:sz w:val="14"/>
-              </w:rPr>
-              <w:t>}</w:t>
+              <w:t>${college_highest_level_unit}</w:t>
             </w:r>
           </w:p>
         </w:tc>
@@ -3625,23 +2823,7 @@
                 <w:rFonts w:ascii="Times New Roman" w:eastAsia="Times New Roman" w:hAnsi="Times New Roman" w:cs="Times New Roman"/>
                 <w:sz w:val="14"/>
               </w:rPr>
-              <w:t>${</w:t>
-            </w:r>
-            <w:proofErr w:type="spellStart"/>
-            <w:r>
-              <w:rPr>
-                <w:rFonts w:ascii="Times New Roman" w:eastAsia="Times New Roman" w:hAnsi="Times New Roman" w:cs="Times New Roman"/>
-                <w:sz w:val="14"/>
-              </w:rPr>
-              <w:t>college_year_graduated</w:t>
-            </w:r>
-            <w:proofErr w:type="spellEnd"/>
-            <w:r>
-              <w:rPr>
-                <w:rFonts w:ascii="Times New Roman" w:eastAsia="Times New Roman" w:hAnsi="Times New Roman" w:cs="Times New Roman"/>
-                <w:sz w:val="14"/>
-              </w:rPr>
-              <w:t>}</w:t>
+              <w:t>${college_year_graduated}</w:t>
             </w:r>
           </w:p>
         </w:tc>
@@ -3695,8 +2877,6 @@
               <w:spacing w:after="0"/>
               <w:rPr>
                 <w:rFonts w:ascii="Times New Roman" w:eastAsia="Times New Roman" w:hAnsi="Times New Roman" w:cs="Times New Roman"/>
-                <w:b/>
-                <w:bCs/>
                 <w:sz w:val="14"/>
                 <w:szCs w:val="14"/>
               </w:rPr>
@@ -3704,34 +2884,10 @@
             <w:r>
               <w:rPr>
                 <w:rFonts w:ascii="Times New Roman" w:eastAsia="Times New Roman" w:hAnsi="Times New Roman" w:cs="Times New Roman"/>
-                <w:b/>
-                <w:bCs/>
                 <w:sz w:val="14"/>
                 <w:szCs w:val="14"/>
               </w:rPr>
-              <w:t>${</w:t>
-            </w:r>
-            <w:proofErr w:type="spellStart"/>
-            <w:r>
-              <w:rPr>
-                <w:rFonts w:ascii="Times New Roman" w:eastAsia="Times New Roman" w:hAnsi="Times New Roman" w:cs="Times New Roman"/>
-                <w:b/>
-                <w:bCs/>
-                <w:sz w:val="14"/>
-                <w:szCs w:val="14"/>
-              </w:rPr>
-              <w:t>graduate_school</w:t>
-            </w:r>
-            <w:proofErr w:type="spellEnd"/>
-            <w:r>
-              <w:rPr>
-                <w:rFonts w:ascii="Times New Roman" w:eastAsia="Times New Roman" w:hAnsi="Times New Roman" w:cs="Times New Roman"/>
-                <w:b/>
-                <w:bCs/>
-                <w:sz w:val="14"/>
-                <w:szCs w:val="14"/>
-              </w:rPr>
-              <w:t>}</w:t>
+              <w:t>${graduate_school}</w:t>
             </w:r>
           </w:p>
         </w:tc>
@@ -3757,34 +2913,10 @@
             <w:r>
               <w:rPr>
                 <w:rFonts w:ascii="Times New Roman" w:eastAsia="Times New Roman" w:hAnsi="Times New Roman" w:cs="Times New Roman"/>
-                <w:b/>
-                <w:bCs/>
                 <w:sz w:val="14"/>
                 <w:szCs w:val="14"/>
               </w:rPr>
-              <w:t>${</w:t>
-            </w:r>
-            <w:proofErr w:type="spellStart"/>
-            <w:r>
-              <w:rPr>
-                <w:rFonts w:ascii="Times New Roman" w:eastAsia="Times New Roman" w:hAnsi="Times New Roman" w:cs="Times New Roman"/>
-                <w:b/>
-                <w:bCs/>
-                <w:sz w:val="14"/>
-                <w:szCs w:val="14"/>
-              </w:rPr>
-              <w:t>graduate_degree_course</w:t>
-            </w:r>
-            <w:proofErr w:type="spellEnd"/>
-            <w:r>
-              <w:rPr>
-                <w:rFonts w:ascii="Times New Roman" w:eastAsia="Times New Roman" w:hAnsi="Times New Roman" w:cs="Times New Roman"/>
-                <w:b/>
-                <w:bCs/>
-                <w:sz w:val="14"/>
-                <w:szCs w:val="14"/>
-              </w:rPr>
-              <w:t>}</w:t>
+              <w:t>${graduate_degree_course}</w:t>
             </w:r>
           </w:p>
         </w:tc>
@@ -3812,23 +2944,7 @@
                 <w:rFonts w:ascii="Times New Roman" w:eastAsia="Times New Roman" w:hAnsi="Times New Roman" w:cs="Times New Roman"/>
                 <w:sz w:val="14"/>
               </w:rPr>
-              <w:t>${</w:t>
-            </w:r>
-            <w:proofErr w:type="spellStart"/>
-            <w:r>
-              <w:rPr>
-                <w:rFonts w:ascii="Times New Roman" w:eastAsia="Times New Roman" w:hAnsi="Times New Roman" w:cs="Times New Roman"/>
-                <w:sz w:val="14"/>
-              </w:rPr>
-              <w:t>graduate_highest_level_unit</w:t>
-            </w:r>
-            <w:proofErr w:type="spellEnd"/>
-            <w:r>
-              <w:rPr>
-                <w:rFonts w:ascii="Times New Roman" w:eastAsia="Times New Roman" w:hAnsi="Times New Roman" w:cs="Times New Roman"/>
-                <w:sz w:val="14"/>
-              </w:rPr>
-              <w:t>}</w:t>
+              <w:t>${graduate_highest_level_unit}</w:t>
             </w:r>
           </w:p>
         </w:tc>
@@ -3856,23 +2972,7 @@
                 <w:rFonts w:ascii="Times New Roman" w:eastAsia="Times New Roman" w:hAnsi="Times New Roman" w:cs="Times New Roman"/>
                 <w:sz w:val="14"/>
               </w:rPr>
-              <w:t>${</w:t>
-            </w:r>
-            <w:proofErr w:type="spellStart"/>
-            <w:r>
-              <w:rPr>
-                <w:rFonts w:ascii="Times New Roman" w:eastAsia="Times New Roman" w:hAnsi="Times New Roman" w:cs="Times New Roman"/>
-                <w:sz w:val="14"/>
-              </w:rPr>
-              <w:t>graduate_year_graduated</w:t>
-            </w:r>
-            <w:proofErr w:type="spellEnd"/>
-            <w:r>
-              <w:rPr>
-                <w:rFonts w:ascii="Times New Roman" w:eastAsia="Times New Roman" w:hAnsi="Times New Roman" w:cs="Times New Roman"/>
-                <w:sz w:val="14"/>
-              </w:rPr>
-              <w:t>}</w:t>
+              <w:t>${graduate_year_graduated}</w:t>
             </w:r>
           </w:p>
         </w:tc>
@@ -3904,9 +3004,8 @@
       <w:tblGrid>
         <w:gridCol w:w="3261"/>
         <w:gridCol w:w="46"/>
-        <w:gridCol w:w="3308"/>
-        <w:gridCol w:w="48"/>
-        <w:gridCol w:w="3260"/>
+        <w:gridCol w:w="3497"/>
+        <w:gridCol w:w="3119"/>
       </w:tblGrid>
       <w:tr>
         <w:trPr>
@@ -3916,7 +3015,7 @@
         <w:tc>
           <w:tcPr>
             <w:tcW w:w="9923" w:type="dxa"/>
-            <w:gridSpan w:val="5"/>
+            <w:gridSpan w:val="4"/>
           </w:tcPr>
           <w:p>
             <w:pPr>
@@ -3962,17 +3061,13 @@
               <w:jc w:val="both"/>
               <w:rPr>
                 <w:rFonts w:ascii="Times New Roman" w:eastAsia="Times New Roman" w:hAnsi="Times New Roman" w:cs="Times New Roman"/>
-                <w:b/>
-                <w:bCs/>
-                <w:sz w:val="18"/>
-                <w:szCs w:val="18"/>
-              </w:rPr>
-            </w:pPr>
-            <w:r>
-              <w:rPr>
-                <w:rFonts w:ascii="Times New Roman" w:eastAsia="Times New Roman" w:hAnsi="Times New Roman" w:cs="Times New Roman"/>
-                <w:b/>
-                <w:bCs/>
+                <w:sz w:val="18"/>
+                <w:szCs w:val="18"/>
+              </w:rPr>
+            </w:pPr>
+            <w:r>
+              <w:rPr>
+                <w:rFonts w:ascii="Times New Roman" w:eastAsia="Times New Roman" w:hAnsi="Times New Roman" w:cs="Times New Roman"/>
                 <w:sz w:val="18"/>
                 <w:szCs w:val="18"/>
               </w:rPr>
@@ -3982,7 +3077,7 @@
         </w:tc>
         <w:tc>
           <w:tcPr>
-            <w:tcW w:w="3308" w:type="dxa"/>
+            <w:tcW w:w="3497" w:type="dxa"/>
             <w:tcBorders>
               <w:left w:val="single" w:sz="4" w:space="0" w:color="auto"/>
               <w:right w:val="single" w:sz="4" w:space="0" w:color="auto"/>
@@ -3994,8 +3089,6 @@
               <w:jc w:val="both"/>
               <w:rPr>
                 <w:rFonts w:ascii="Times New Roman" w:eastAsia="Times New Roman" w:hAnsi="Times New Roman" w:cs="Times New Roman"/>
-                <w:b/>
-                <w:bCs/>
                 <w:sz w:val="18"/>
                 <w:szCs w:val="18"/>
                 <w:u w:val="single"/>
@@ -4004,8 +3097,6 @@
             <w:r>
               <w:rPr>
                 <w:rFonts w:ascii="Times New Roman" w:eastAsia="Times New Roman" w:hAnsi="Times New Roman" w:cs="Times New Roman"/>
-                <w:b/>
-                <w:bCs/>
                 <w:sz w:val="18"/>
                 <w:szCs w:val="18"/>
               </w:rPr>
@@ -4015,8 +3106,7 @@
         </w:tc>
         <w:tc>
           <w:tcPr>
-            <w:tcW w:w="3308" w:type="dxa"/>
-            <w:gridSpan w:val="2"/>
+            <w:tcW w:w="3119" w:type="dxa"/>
             <w:tcBorders>
               <w:left w:val="single" w:sz="4" w:space="0" w:color="auto"/>
             </w:tcBorders>
@@ -4027,8 +3117,6 @@
               <w:jc w:val="both"/>
               <w:rPr>
                 <w:rFonts w:ascii="Times New Roman" w:eastAsia="Times New Roman" w:hAnsi="Times New Roman" w:cs="Times New Roman"/>
-                <w:b/>
-                <w:bCs/>
                 <w:sz w:val="18"/>
                 <w:szCs w:val="18"/>
                 <w:u w:val="single"/>
@@ -4037,8 +3125,6 @@
             <w:r>
               <w:rPr>
                 <w:rFonts w:ascii="Times New Roman" w:eastAsia="Times New Roman" w:hAnsi="Times New Roman" w:cs="Times New Roman"/>
-                <w:b/>
-                <w:bCs/>
                 <w:sz w:val="18"/>
                 <w:szCs w:val="18"/>
               </w:rPr>
@@ -4067,17 +3153,13 @@
               <w:jc w:val="both"/>
               <w:rPr>
                 <w:rFonts w:ascii="Times New Roman" w:eastAsia="Times New Roman" w:hAnsi="Times New Roman" w:cs="Times New Roman"/>
-                <w:b/>
-                <w:bCs/>
-                <w:sz w:val="18"/>
-                <w:szCs w:val="18"/>
-              </w:rPr>
-            </w:pPr>
-            <w:r>
-              <w:rPr>
-                <w:rFonts w:ascii="Times New Roman" w:eastAsia="Times New Roman" w:hAnsi="Times New Roman" w:cs="Times New Roman"/>
-                <w:b/>
-                <w:bCs/>
+                <w:sz w:val="18"/>
+                <w:szCs w:val="18"/>
+              </w:rPr>
+            </w:pPr>
+            <w:r>
+              <w:rPr>
+                <w:rFonts w:ascii="Times New Roman" w:eastAsia="Times New Roman" w:hAnsi="Times New Roman" w:cs="Times New Roman"/>
                 <w:sz w:val="18"/>
                 <w:szCs w:val="18"/>
               </w:rPr>
@@ -4087,7 +3169,7 @@
         </w:tc>
         <w:tc>
           <w:tcPr>
-            <w:tcW w:w="3308" w:type="dxa"/>
+            <w:tcW w:w="3497" w:type="dxa"/>
             <w:tcBorders>
               <w:left w:val="single" w:sz="4" w:space="0" w:color="auto"/>
               <w:right w:val="single" w:sz="4" w:space="0" w:color="auto"/>
@@ -4099,8 +3181,6 @@
               <w:jc w:val="both"/>
               <w:rPr>
                 <w:rFonts w:ascii="Times New Roman" w:eastAsia="Times New Roman" w:hAnsi="Times New Roman" w:cs="Times New Roman"/>
-                <w:b/>
-                <w:bCs/>
                 <w:sz w:val="18"/>
                 <w:szCs w:val="18"/>
                 <w:u w:val="single"/>
@@ -4109,8 +3189,6 @@
             <w:r>
               <w:rPr>
                 <w:rFonts w:ascii="Times New Roman" w:eastAsia="Times New Roman" w:hAnsi="Times New Roman" w:cs="Times New Roman"/>
-                <w:b/>
-                <w:bCs/>
                 <w:sz w:val="18"/>
                 <w:szCs w:val="18"/>
               </w:rPr>
@@ -4120,8 +3198,7 @@
         </w:tc>
         <w:tc>
           <w:tcPr>
-            <w:tcW w:w="3308" w:type="dxa"/>
-            <w:gridSpan w:val="2"/>
+            <w:tcW w:w="3119" w:type="dxa"/>
             <w:tcBorders>
               <w:left w:val="single" w:sz="4" w:space="0" w:color="auto"/>
             </w:tcBorders>
@@ -4132,8 +3209,6 @@
               <w:jc w:val="both"/>
               <w:rPr>
                 <w:rFonts w:ascii="Times New Roman" w:eastAsia="Times New Roman" w:hAnsi="Times New Roman" w:cs="Times New Roman"/>
-                <w:b/>
-                <w:bCs/>
                 <w:sz w:val="18"/>
                 <w:szCs w:val="18"/>
                 <w:u w:val="single"/>
@@ -4142,8 +3217,6 @@
             <w:r>
               <w:rPr>
                 <w:rFonts w:ascii="Times New Roman" w:eastAsia="Times New Roman" w:hAnsi="Times New Roman" w:cs="Times New Roman"/>
-                <w:b/>
-                <w:bCs/>
                 <w:sz w:val="18"/>
                 <w:szCs w:val="18"/>
               </w:rPr>
@@ -4159,7 +3232,8 @@
         </w:trPr>
         <w:tc>
           <w:tcPr>
-            <w:tcW w:w="3261" w:type="dxa"/>
+            <w:tcW w:w="3307" w:type="dxa"/>
+            <w:gridSpan w:val="2"/>
             <w:tcBorders>
               <w:left w:val="single" w:sz="4" w:space="0" w:color="auto"/>
               <w:right w:val="single" w:sz="4" w:space="0" w:color="auto"/>
@@ -4171,17 +3245,13 @@
               <w:jc w:val="both"/>
               <w:rPr>
                 <w:rFonts w:ascii="Times New Roman" w:eastAsia="Times New Roman" w:hAnsi="Times New Roman" w:cs="Times New Roman"/>
-                <w:b/>
-                <w:bCs/>
-                <w:sz w:val="18"/>
-                <w:szCs w:val="18"/>
-              </w:rPr>
-            </w:pPr>
-            <w:r>
-              <w:rPr>
-                <w:rFonts w:ascii="Times New Roman" w:eastAsia="Times New Roman" w:hAnsi="Times New Roman" w:cs="Times New Roman"/>
-                <w:b/>
-                <w:bCs/>
+                <w:sz w:val="18"/>
+                <w:szCs w:val="18"/>
+              </w:rPr>
+            </w:pPr>
+            <w:r>
+              <w:rPr>
+                <w:rFonts w:ascii="Times New Roman" w:eastAsia="Times New Roman" w:hAnsi="Times New Roman" w:cs="Times New Roman"/>
                 <w:sz w:val="18"/>
                 <w:szCs w:val="18"/>
               </w:rPr>
@@ -4192,8 +3262,7 @@
         </w:tc>
         <w:tc>
           <w:tcPr>
-            <w:tcW w:w="3402" w:type="dxa"/>
-            <w:gridSpan w:val="3"/>
+            <w:tcW w:w="3497" w:type="dxa"/>
             <w:tcBorders>
               <w:left w:val="single" w:sz="4" w:space="0" w:color="auto"/>
               <w:right w:val="single" w:sz="4" w:space="0" w:color="auto"/>
@@ -4205,8 +3274,6 @@
               <w:jc w:val="both"/>
               <w:rPr>
                 <w:rFonts w:ascii="Times New Roman" w:eastAsia="Times New Roman" w:hAnsi="Times New Roman" w:cs="Times New Roman"/>
-                <w:b/>
-                <w:bCs/>
                 <w:sz w:val="18"/>
                 <w:szCs w:val="18"/>
                 <w:u w:val="single"/>
@@ -4215,8 +3282,6 @@
             <w:r>
               <w:rPr>
                 <w:rFonts w:ascii="Times New Roman" w:eastAsia="Times New Roman" w:hAnsi="Times New Roman" w:cs="Times New Roman"/>
-                <w:b/>
-                <w:bCs/>
                 <w:sz w:val="18"/>
                 <w:szCs w:val="18"/>
               </w:rPr>
@@ -4226,7 +3291,7 @@
         </w:tc>
         <w:tc>
           <w:tcPr>
-            <w:tcW w:w="3260" w:type="dxa"/>
+            <w:tcW w:w="3119" w:type="dxa"/>
             <w:tcBorders>
               <w:left w:val="single" w:sz="4" w:space="0" w:color="auto"/>
             </w:tcBorders>
@@ -4237,8 +3302,6 @@
               <w:jc w:val="both"/>
               <w:rPr>
                 <w:rFonts w:ascii="Times New Roman" w:eastAsia="Times New Roman" w:hAnsi="Times New Roman" w:cs="Times New Roman"/>
-                <w:b/>
-                <w:bCs/>
                 <w:sz w:val="18"/>
                 <w:szCs w:val="18"/>
                 <w:u w:val="single"/>
@@ -4247,8 +3310,6 @@
             <w:r>
               <w:rPr>
                 <w:rFonts w:ascii="Times New Roman" w:eastAsia="Times New Roman" w:hAnsi="Times New Roman" w:cs="Times New Roman"/>
-                <w:b/>
-                <w:bCs/>
                 <w:sz w:val="18"/>
                 <w:szCs w:val="18"/>
               </w:rPr>
@@ -4697,25 +3758,7 @@
                 <w:sz w:val="16"/>
                 <w:szCs w:val="16"/>
               </w:rPr>
-              <w:t>${</w:t>
-            </w:r>
-            <w:proofErr w:type="spellStart"/>
-            <w:r>
-              <w:rPr>
-                <w:rFonts w:ascii="Times New Roman" w:eastAsia="Times New Roman" w:hAnsi="Times New Roman" w:cs="Times New Roman"/>
-                <w:sz w:val="16"/>
-                <w:szCs w:val="16"/>
-              </w:rPr>
-              <w:t>member_full_name</w:t>
-            </w:r>
-            <w:proofErr w:type="spellEnd"/>
-            <w:r>
-              <w:rPr>
-                <w:rFonts w:ascii="Times New Roman" w:eastAsia="Times New Roman" w:hAnsi="Times New Roman" w:cs="Times New Roman"/>
-                <w:sz w:val="16"/>
-                <w:szCs w:val="16"/>
-              </w:rPr>
-              <w:t>}</w:t>
+              <w:t>${member_full_name}</w:t>
             </w:r>
           </w:p>
         </w:tc>
@@ -4745,27 +3788,7 @@
                 <w:szCs w:val="16"/>
                 <w:u w:val="single"/>
               </w:rPr>
-              <w:t>${</w:t>
-            </w:r>
-            <w:proofErr w:type="spellStart"/>
-            <w:r>
-              <w:rPr>
-                <w:rFonts w:ascii="Times New Roman" w:eastAsia="Times New Roman" w:hAnsi="Times New Roman" w:cs="Times New Roman"/>
-                <w:sz w:val="16"/>
-                <w:szCs w:val="16"/>
-                <w:u w:val="single"/>
-              </w:rPr>
-              <w:t>member_designation</w:t>
-            </w:r>
-            <w:proofErr w:type="spellEnd"/>
-            <w:r>
-              <w:rPr>
-                <w:rFonts w:ascii="Times New Roman" w:eastAsia="Times New Roman" w:hAnsi="Times New Roman" w:cs="Times New Roman"/>
-                <w:sz w:val="16"/>
-                <w:szCs w:val="16"/>
-                <w:u w:val="single"/>
-              </w:rPr>
-              <w:t>}</w:t>
+              <w:t>${member_designation}</w:t>
             </w:r>
           </w:p>
         </w:tc>
@@ -4795,27 +3818,7 @@
                 <w:szCs w:val="16"/>
                 <w:u w:val="single"/>
               </w:rPr>
-              <w:t>${</w:t>
-            </w:r>
-            <w:proofErr w:type="spellStart"/>
-            <w:r>
-              <w:rPr>
-                <w:rFonts w:ascii="Times New Roman" w:eastAsia="Times New Roman" w:hAnsi="Times New Roman" w:cs="Times New Roman"/>
-                <w:sz w:val="16"/>
-                <w:szCs w:val="16"/>
-                <w:u w:val="single"/>
-              </w:rPr>
-              <w:t>member_phone</w:t>
-            </w:r>
-            <w:proofErr w:type="spellEnd"/>
-            <w:r>
-              <w:rPr>
-                <w:rFonts w:ascii="Times New Roman" w:eastAsia="Times New Roman" w:hAnsi="Times New Roman" w:cs="Times New Roman"/>
-                <w:sz w:val="16"/>
-                <w:szCs w:val="16"/>
-                <w:u w:val="single"/>
-              </w:rPr>
-              <w:t>}</w:t>
+              <w:t>${member_phone}</w:t>
             </w:r>
           </w:p>
         </w:tc>
@@ -4845,27 +3848,7 @@
                 <w:szCs w:val="16"/>
                 <w:u w:val="single"/>
               </w:rPr>
-              <w:t>${</w:t>
-            </w:r>
-            <w:proofErr w:type="spellStart"/>
-            <w:r>
-              <w:rPr>
-                <w:rFonts w:ascii="Times New Roman" w:eastAsia="Times New Roman" w:hAnsi="Times New Roman" w:cs="Times New Roman"/>
-                <w:sz w:val="16"/>
-                <w:szCs w:val="16"/>
-                <w:u w:val="single"/>
-              </w:rPr>
-              <w:t>member_address</w:t>
-            </w:r>
-            <w:proofErr w:type="spellEnd"/>
-            <w:r>
-              <w:rPr>
-                <w:rFonts w:ascii="Times New Roman" w:eastAsia="Times New Roman" w:hAnsi="Times New Roman" w:cs="Times New Roman"/>
-                <w:sz w:val="16"/>
-                <w:szCs w:val="16"/>
-                <w:u w:val="single"/>
-              </w:rPr>
-              <w:t>}</w:t>
+              <w:t>${member_address}</w:t>
             </w:r>
           </w:p>
         </w:tc>
@@ -4895,27 +3878,7 @@
                 <w:szCs w:val="16"/>
                 <w:u w:val="single"/>
               </w:rPr>
-              <w:t>${</w:t>
-            </w:r>
-            <w:proofErr w:type="spellStart"/>
-            <w:r>
-              <w:rPr>
-                <w:rFonts w:ascii="Times New Roman" w:eastAsia="Times New Roman" w:hAnsi="Times New Roman" w:cs="Times New Roman"/>
-                <w:sz w:val="16"/>
-                <w:szCs w:val="16"/>
-                <w:u w:val="single"/>
-              </w:rPr>
-              <w:t>member_date_of_birth</w:t>
-            </w:r>
-            <w:proofErr w:type="spellEnd"/>
-            <w:r>
-              <w:rPr>
-                <w:rFonts w:ascii="Times New Roman" w:eastAsia="Times New Roman" w:hAnsi="Times New Roman" w:cs="Times New Roman"/>
-                <w:sz w:val="16"/>
-                <w:szCs w:val="16"/>
-                <w:u w:val="single"/>
-              </w:rPr>
-              <w:t>}</w:t>
+              <w:t>${member_date_of_birth}</w:t>
             </w:r>
           </w:p>
         </w:tc>
@@ -4945,27 +3908,7 @@
                 <w:szCs w:val="16"/>
                 <w:u w:val="single"/>
               </w:rPr>
-              <w:t>${</w:t>
-            </w:r>
-            <w:proofErr w:type="spellStart"/>
-            <w:r>
-              <w:rPr>
-                <w:rFonts w:ascii="Times New Roman" w:eastAsia="Times New Roman" w:hAnsi="Times New Roman" w:cs="Times New Roman"/>
-                <w:sz w:val="16"/>
-                <w:szCs w:val="16"/>
-                <w:u w:val="single"/>
-              </w:rPr>
-              <w:t>member_email</w:t>
-            </w:r>
-            <w:proofErr w:type="spellEnd"/>
-            <w:r>
-              <w:rPr>
-                <w:rFonts w:ascii="Times New Roman" w:eastAsia="Times New Roman" w:hAnsi="Times New Roman" w:cs="Times New Roman"/>
-                <w:sz w:val="16"/>
-                <w:szCs w:val="16"/>
-                <w:u w:val="single"/>
-              </w:rPr>
-              <w:t>}</w:t>
+              <w:t>${member_email}</w:t>
             </w:r>
           </w:p>
         </w:tc>
@@ -4995,27 +3938,7 @@
                 <w:szCs w:val="16"/>
                 <w:u w:val="single"/>
               </w:rPr>
-              <w:t>${</w:t>
-            </w:r>
-            <w:proofErr w:type="spellStart"/>
-            <w:r>
-              <w:rPr>
-                <w:rFonts w:ascii="Times New Roman" w:eastAsia="Times New Roman" w:hAnsi="Times New Roman" w:cs="Times New Roman"/>
-                <w:sz w:val="16"/>
-                <w:szCs w:val="16"/>
-                <w:u w:val="single"/>
-              </w:rPr>
-              <w:t>member_citizenship</w:t>
-            </w:r>
-            <w:proofErr w:type="spellEnd"/>
-            <w:r>
-              <w:rPr>
-                <w:rFonts w:ascii="Times New Roman" w:eastAsia="Times New Roman" w:hAnsi="Times New Roman" w:cs="Times New Roman"/>
-                <w:sz w:val="16"/>
-                <w:szCs w:val="16"/>
-                <w:u w:val="single"/>
-              </w:rPr>
-              <w:t>}</w:t>
+              <w:t>${member_citizenship}</w:t>
             </w:r>
           </w:p>
         </w:tc>
@@ -5045,27 +3968,7 @@
                 <w:szCs w:val="16"/>
                 <w:u w:val="single"/>
               </w:rPr>
-              <w:t>${</w:t>
-            </w:r>
-            <w:proofErr w:type="spellStart"/>
-            <w:r>
-              <w:rPr>
-                <w:rFonts w:ascii="Times New Roman" w:eastAsia="Times New Roman" w:hAnsi="Times New Roman" w:cs="Times New Roman"/>
-                <w:sz w:val="16"/>
-                <w:szCs w:val="16"/>
-                <w:u w:val="single"/>
-              </w:rPr>
-              <w:t>member_sex</w:t>
-            </w:r>
-            <w:proofErr w:type="spellEnd"/>
-            <w:r>
-              <w:rPr>
-                <w:rFonts w:ascii="Times New Roman" w:eastAsia="Times New Roman" w:hAnsi="Times New Roman" w:cs="Times New Roman"/>
-                <w:sz w:val="16"/>
-                <w:szCs w:val="16"/>
-                <w:u w:val="single"/>
-              </w:rPr>
-              <w:t>}</w:t>
+              <w:t>${member_sex}</w:t>
             </w:r>
           </w:p>
         </w:tc>
@@ -5095,27 +3998,7 @@
                 <w:szCs w:val="16"/>
                 <w:u w:val="single"/>
               </w:rPr>
-              <w:t>${</w:t>
-            </w:r>
-            <w:proofErr w:type="spellStart"/>
-            <w:r>
-              <w:rPr>
-                <w:rFonts w:ascii="Times New Roman" w:eastAsia="Times New Roman" w:hAnsi="Times New Roman" w:cs="Times New Roman"/>
-                <w:sz w:val="16"/>
-                <w:szCs w:val="16"/>
-                <w:u w:val="single"/>
-              </w:rPr>
-              <w:t>member_civil_status</w:t>
-            </w:r>
-            <w:proofErr w:type="spellEnd"/>
-            <w:r>
-              <w:rPr>
-                <w:rFonts w:ascii="Times New Roman" w:eastAsia="Times New Roman" w:hAnsi="Times New Roman" w:cs="Times New Roman"/>
-                <w:sz w:val="16"/>
-                <w:szCs w:val="16"/>
-                <w:u w:val="single"/>
-              </w:rPr>
-              <w:t>}</w:t>
+              <w:t>${member_civil_status}</w:t>
             </w:r>
           </w:p>
         </w:tc>
@@ -5271,25 +4154,7 @@
                 <w:sz w:val="18"/>
                 <w:szCs w:val="18"/>
               </w:rPr>
-              <w:t xml:space="preserve">25. NAME &amp; ADDRESS OF ORGANIZATION                                                                                                  </w:t>
-            </w:r>
-            <w:proofErr w:type="gramStart"/>
-            <w:r>
-              <w:rPr>
-                <w:rFonts w:ascii="Times New Roman" w:eastAsia="Times New Roman" w:hAnsi="Times New Roman" w:cs="Times New Roman"/>
-                <w:sz w:val="18"/>
-                <w:szCs w:val="18"/>
-              </w:rPr>
-              <w:t xml:space="preserve">   (</w:t>
-            </w:r>
-            <w:proofErr w:type="gramEnd"/>
-            <w:r>
-              <w:rPr>
-                <w:rFonts w:ascii="Times New Roman" w:eastAsia="Times New Roman" w:hAnsi="Times New Roman" w:cs="Times New Roman"/>
-                <w:sz w:val="18"/>
-                <w:szCs w:val="18"/>
-              </w:rPr>
-              <w:t>Write in full)</w:t>
+              <w:t>25. NAME &amp; ADDRESS OF ORGANIZATION                                                                                                     (Write in full)</w:t>
             </w:r>
           </w:p>
         </w:tc>
@@ -5540,8 +4405,6 @@
               <w:jc w:val="both"/>
               <w:rPr>
                 <w:rFonts w:ascii="Times New Roman" w:eastAsia="Times New Roman" w:hAnsi="Times New Roman" w:cs="Times New Roman"/>
-                <w:b/>
-                <w:bCs/>
                 <w:sz w:val="18"/>
                 <w:szCs w:val="18"/>
                 <w:u w:val="single"/>
@@ -5550,37 +4413,11 @@
             <w:r>
               <w:rPr>
                 <w:rFonts w:ascii="Times New Roman" w:eastAsia="Times New Roman" w:hAnsi="Times New Roman" w:cs="Times New Roman"/>
-                <w:b/>
-                <w:bCs/>
                 <w:sz w:val="18"/>
                 <w:szCs w:val="18"/>
                 <w:u w:val="single"/>
               </w:rPr>
-              <w:t>${</w:t>
-            </w:r>
-            <w:proofErr w:type="spellStart"/>
-            <w:r>
-              <w:rPr>
-                <w:rFonts w:ascii="Times New Roman" w:eastAsia="Times New Roman" w:hAnsi="Times New Roman" w:cs="Times New Roman"/>
-                <w:b/>
-                <w:bCs/>
-                <w:sz w:val="18"/>
-                <w:szCs w:val="18"/>
-                <w:u w:val="single"/>
-              </w:rPr>
-              <w:t>incub_org</w:t>
-            </w:r>
-            <w:proofErr w:type="spellEnd"/>
-            <w:r>
-              <w:rPr>
-                <w:rFonts w:ascii="Times New Roman" w:eastAsia="Times New Roman" w:hAnsi="Times New Roman" w:cs="Times New Roman"/>
-                <w:b/>
-                <w:bCs/>
-                <w:sz w:val="18"/>
-                <w:szCs w:val="18"/>
-                <w:u w:val="single"/>
-              </w:rPr>
-              <w:t>}</w:t>
+              <w:t>${incub_org}</w:t>
             </w:r>
           </w:p>
         </w:tc>
@@ -5600,8 +4437,6 @@
               <w:jc w:val="both"/>
               <w:rPr>
                 <w:rFonts w:ascii="Times New Roman" w:eastAsia="Times New Roman" w:hAnsi="Times New Roman" w:cs="Times New Roman"/>
-                <w:b/>
-                <w:bCs/>
                 <w:sz w:val="18"/>
                 <w:szCs w:val="18"/>
                 <w:u w:val="single"/>
@@ -5610,37 +4445,11 @@
             <w:r>
               <w:rPr>
                 <w:rFonts w:ascii="Times New Roman" w:eastAsia="Times New Roman" w:hAnsi="Times New Roman" w:cs="Times New Roman"/>
-                <w:b/>
-                <w:bCs/>
                 <w:sz w:val="18"/>
                 <w:szCs w:val="18"/>
                 <w:u w:val="single"/>
               </w:rPr>
-              <w:t>${</w:t>
-            </w:r>
-            <w:proofErr w:type="spellStart"/>
-            <w:r>
-              <w:rPr>
-                <w:rFonts w:ascii="Times New Roman" w:eastAsia="Times New Roman" w:hAnsi="Times New Roman" w:cs="Times New Roman"/>
-                <w:b/>
-                <w:bCs/>
-                <w:sz w:val="18"/>
-                <w:szCs w:val="18"/>
-                <w:u w:val="single"/>
-              </w:rPr>
-              <w:t>incub_from</w:t>
-            </w:r>
-            <w:proofErr w:type="spellEnd"/>
-            <w:r>
-              <w:rPr>
-                <w:rFonts w:ascii="Times New Roman" w:eastAsia="Times New Roman" w:hAnsi="Times New Roman" w:cs="Times New Roman"/>
-                <w:b/>
-                <w:bCs/>
-                <w:sz w:val="18"/>
-                <w:szCs w:val="18"/>
-                <w:u w:val="single"/>
-              </w:rPr>
-              <w:t>}</w:t>
+              <w:t>${incub_from}</w:t>
             </w:r>
           </w:p>
         </w:tc>
@@ -5660,8 +4469,6 @@
               <w:jc w:val="both"/>
               <w:rPr>
                 <w:rFonts w:ascii="Times New Roman" w:eastAsia="Times New Roman" w:hAnsi="Times New Roman" w:cs="Times New Roman"/>
-                <w:b/>
-                <w:bCs/>
                 <w:sz w:val="18"/>
                 <w:szCs w:val="18"/>
                 <w:u w:val="single"/>
@@ -5670,37 +4477,11 @@
             <w:r>
               <w:rPr>
                 <w:rFonts w:ascii="Times New Roman" w:eastAsia="Times New Roman" w:hAnsi="Times New Roman" w:cs="Times New Roman"/>
-                <w:b/>
-                <w:bCs/>
                 <w:sz w:val="18"/>
                 <w:szCs w:val="18"/>
                 <w:u w:val="single"/>
               </w:rPr>
-              <w:t>${</w:t>
-            </w:r>
-            <w:proofErr w:type="spellStart"/>
-            <w:r>
-              <w:rPr>
-                <w:rFonts w:ascii="Times New Roman" w:eastAsia="Times New Roman" w:hAnsi="Times New Roman" w:cs="Times New Roman"/>
-                <w:b/>
-                <w:bCs/>
-                <w:sz w:val="18"/>
-                <w:szCs w:val="18"/>
-                <w:u w:val="single"/>
-              </w:rPr>
-              <w:t>incub_to</w:t>
-            </w:r>
-            <w:proofErr w:type="spellEnd"/>
-            <w:r>
-              <w:rPr>
-                <w:rFonts w:ascii="Times New Roman" w:eastAsia="Times New Roman" w:hAnsi="Times New Roman" w:cs="Times New Roman"/>
-                <w:b/>
-                <w:bCs/>
-                <w:sz w:val="18"/>
-                <w:szCs w:val="18"/>
-                <w:u w:val="single"/>
-              </w:rPr>
-              <w:t>}</w:t>
+              <w:t>${incub_to}</w:t>
             </w:r>
           </w:p>
         </w:tc>
@@ -5720,8 +4501,6 @@
               <w:jc w:val="both"/>
               <w:rPr>
                 <w:rFonts w:ascii="Times New Roman" w:eastAsia="Times New Roman" w:hAnsi="Times New Roman" w:cs="Times New Roman"/>
-                <w:b/>
-                <w:bCs/>
                 <w:sz w:val="18"/>
                 <w:szCs w:val="18"/>
                 <w:u w:val="single"/>
@@ -5730,37 +4509,11 @@
             <w:r>
               <w:rPr>
                 <w:rFonts w:ascii="Times New Roman" w:eastAsia="Times New Roman" w:hAnsi="Times New Roman" w:cs="Times New Roman"/>
-                <w:b/>
-                <w:bCs/>
                 <w:sz w:val="18"/>
                 <w:szCs w:val="18"/>
                 <w:u w:val="single"/>
               </w:rPr>
-              <w:t>${</w:t>
-            </w:r>
-            <w:proofErr w:type="spellStart"/>
-            <w:r>
-              <w:rPr>
-                <w:rFonts w:ascii="Times New Roman" w:eastAsia="Times New Roman" w:hAnsi="Times New Roman" w:cs="Times New Roman"/>
-                <w:b/>
-                <w:bCs/>
-                <w:sz w:val="18"/>
-                <w:szCs w:val="18"/>
-                <w:u w:val="single"/>
-              </w:rPr>
-              <w:t>incub_hours</w:t>
-            </w:r>
-            <w:proofErr w:type="spellEnd"/>
-            <w:r>
-              <w:rPr>
-                <w:rFonts w:ascii="Times New Roman" w:eastAsia="Times New Roman" w:hAnsi="Times New Roman" w:cs="Times New Roman"/>
-                <w:b/>
-                <w:bCs/>
-                <w:sz w:val="18"/>
-                <w:szCs w:val="18"/>
-                <w:u w:val="single"/>
-              </w:rPr>
-              <w:t>}</w:t>
+              <w:t>${incub_hours}</w:t>
             </w:r>
           </w:p>
         </w:tc>
@@ -5780,8 +4533,6 @@
               <w:jc w:val="both"/>
               <w:rPr>
                 <w:rFonts w:ascii="Times New Roman" w:eastAsia="Times New Roman" w:hAnsi="Times New Roman" w:cs="Times New Roman"/>
-                <w:b/>
-                <w:bCs/>
                 <w:sz w:val="18"/>
                 <w:szCs w:val="18"/>
                 <w:u w:val="single"/>
@@ -5790,37 +4541,11 @@
             <w:r>
               <w:rPr>
                 <w:rFonts w:ascii="Times New Roman" w:eastAsia="Times New Roman" w:hAnsi="Times New Roman" w:cs="Times New Roman"/>
-                <w:b/>
-                <w:bCs/>
                 <w:sz w:val="18"/>
                 <w:szCs w:val="18"/>
                 <w:u w:val="single"/>
               </w:rPr>
-              <w:t>${</w:t>
-            </w:r>
-            <w:proofErr w:type="spellStart"/>
-            <w:r>
-              <w:rPr>
-                <w:rFonts w:ascii="Times New Roman" w:eastAsia="Times New Roman" w:hAnsi="Times New Roman" w:cs="Times New Roman"/>
-                <w:b/>
-                <w:bCs/>
-                <w:sz w:val="18"/>
-                <w:szCs w:val="18"/>
-                <w:u w:val="single"/>
-              </w:rPr>
-              <w:t>incub_focus</w:t>
-            </w:r>
-            <w:proofErr w:type="spellEnd"/>
-            <w:r>
-              <w:rPr>
-                <w:rFonts w:ascii="Times New Roman" w:eastAsia="Times New Roman" w:hAnsi="Times New Roman" w:cs="Times New Roman"/>
-                <w:b/>
-                <w:bCs/>
-                <w:sz w:val="18"/>
-                <w:szCs w:val="18"/>
-                <w:u w:val="single"/>
-              </w:rPr>
-              <w:t>}</w:t>
+              <w:t>${incub_focus}</w:t>
             </w:r>
           </w:p>
         </w:tc>
@@ -6208,8 +4933,6 @@
               <w:spacing w:after="0"/>
               <w:rPr>
                 <w:rFonts w:ascii="Times New Roman" w:eastAsia="Times New Roman" w:hAnsi="Times New Roman" w:cs="Times New Roman"/>
-                <w:b/>
-                <w:bCs/>
                 <w:sz w:val="18"/>
                 <w:szCs w:val="18"/>
                 <w:u w:val="single"/>
@@ -6218,37 +4941,11 @@
             <w:r>
               <w:rPr>
                 <w:rFonts w:ascii="Times New Roman" w:eastAsia="Times New Roman" w:hAnsi="Times New Roman" w:cs="Times New Roman"/>
-                <w:b/>
-                <w:bCs/>
                 <w:sz w:val="18"/>
                 <w:szCs w:val="18"/>
                 <w:u w:val="single"/>
               </w:rPr>
-              <w:t>${</w:t>
-            </w:r>
-            <w:proofErr w:type="spellStart"/>
-            <w:r>
-              <w:rPr>
-                <w:rFonts w:ascii="Times New Roman" w:eastAsia="Times New Roman" w:hAnsi="Times New Roman" w:cs="Times New Roman"/>
-                <w:b/>
-                <w:bCs/>
-                <w:sz w:val="18"/>
-                <w:szCs w:val="18"/>
-                <w:u w:val="single"/>
-              </w:rPr>
-              <w:t>ld_title</w:t>
-            </w:r>
-            <w:proofErr w:type="spellEnd"/>
-            <w:r>
-              <w:rPr>
-                <w:rFonts w:ascii="Times New Roman" w:eastAsia="Times New Roman" w:hAnsi="Times New Roman" w:cs="Times New Roman"/>
-                <w:b/>
-                <w:bCs/>
-                <w:sz w:val="18"/>
-                <w:szCs w:val="18"/>
-                <w:u w:val="single"/>
-              </w:rPr>
-              <w:t>}</w:t>
+              <w:t>${ld_title}</w:t>
             </w:r>
           </w:p>
         </w:tc>
@@ -6267,8 +4964,6 @@
               <w:spacing w:after="0"/>
               <w:rPr>
                 <w:rFonts w:ascii="Times New Roman" w:eastAsia="Times New Roman" w:hAnsi="Times New Roman" w:cs="Times New Roman"/>
-                <w:b/>
-                <w:bCs/>
                 <w:sz w:val="18"/>
                 <w:szCs w:val="18"/>
                 <w:u w:val="single"/>
@@ -6277,37 +4972,11 @@
             <w:r>
               <w:rPr>
                 <w:rFonts w:ascii="Times New Roman" w:eastAsia="Times New Roman" w:hAnsi="Times New Roman" w:cs="Times New Roman"/>
-                <w:b/>
-                <w:bCs/>
                 <w:sz w:val="18"/>
                 <w:szCs w:val="18"/>
                 <w:u w:val="single"/>
               </w:rPr>
-              <w:t>${</w:t>
-            </w:r>
-            <w:proofErr w:type="spellStart"/>
-            <w:r>
-              <w:rPr>
-                <w:rFonts w:ascii="Times New Roman" w:eastAsia="Times New Roman" w:hAnsi="Times New Roman" w:cs="Times New Roman"/>
-                <w:b/>
-                <w:bCs/>
-                <w:sz w:val="18"/>
-                <w:szCs w:val="18"/>
-                <w:u w:val="single"/>
-              </w:rPr>
-              <w:t>ld_from</w:t>
-            </w:r>
-            <w:proofErr w:type="spellEnd"/>
-            <w:r>
-              <w:rPr>
-                <w:rFonts w:ascii="Times New Roman" w:eastAsia="Times New Roman" w:hAnsi="Times New Roman" w:cs="Times New Roman"/>
-                <w:b/>
-                <w:bCs/>
-                <w:sz w:val="18"/>
-                <w:szCs w:val="18"/>
-                <w:u w:val="single"/>
-              </w:rPr>
-              <w:t>}</w:t>
+              <w:t>${ld_from}</w:t>
             </w:r>
           </w:p>
         </w:tc>
@@ -6326,8 +4995,6 @@
               <w:spacing w:after="0"/>
               <w:rPr>
                 <w:rFonts w:ascii="Times New Roman" w:eastAsia="Times New Roman" w:hAnsi="Times New Roman" w:cs="Times New Roman"/>
-                <w:b/>
-                <w:bCs/>
                 <w:sz w:val="18"/>
                 <w:szCs w:val="18"/>
                 <w:u w:val="single"/>
@@ -6336,37 +5003,11 @@
             <w:r>
               <w:rPr>
                 <w:rFonts w:ascii="Times New Roman" w:eastAsia="Times New Roman" w:hAnsi="Times New Roman" w:cs="Times New Roman"/>
-                <w:b/>
-                <w:bCs/>
                 <w:sz w:val="18"/>
                 <w:szCs w:val="18"/>
                 <w:u w:val="single"/>
               </w:rPr>
-              <w:t>${</w:t>
-            </w:r>
-            <w:proofErr w:type="spellStart"/>
-            <w:r>
-              <w:rPr>
-                <w:rFonts w:ascii="Times New Roman" w:eastAsia="Times New Roman" w:hAnsi="Times New Roman" w:cs="Times New Roman"/>
-                <w:b/>
-                <w:bCs/>
-                <w:sz w:val="18"/>
-                <w:szCs w:val="18"/>
-                <w:u w:val="single"/>
-              </w:rPr>
-              <w:t>ld_to</w:t>
-            </w:r>
-            <w:proofErr w:type="spellEnd"/>
-            <w:r>
-              <w:rPr>
-                <w:rFonts w:ascii="Times New Roman" w:eastAsia="Times New Roman" w:hAnsi="Times New Roman" w:cs="Times New Roman"/>
-                <w:b/>
-                <w:bCs/>
-                <w:sz w:val="18"/>
-                <w:szCs w:val="18"/>
-                <w:u w:val="single"/>
-              </w:rPr>
-              <w:t>}</w:t>
+              <w:t>${ld_to}</w:t>
             </w:r>
           </w:p>
         </w:tc>
@@ -6385,8 +5026,6 @@
               <w:spacing w:after="0"/>
               <w:rPr>
                 <w:rFonts w:ascii="Times New Roman" w:eastAsia="Times New Roman" w:hAnsi="Times New Roman" w:cs="Times New Roman"/>
-                <w:b/>
-                <w:bCs/>
                 <w:sz w:val="18"/>
                 <w:szCs w:val="18"/>
                 <w:u w:val="single"/>
@@ -6395,37 +5034,11 @@
             <w:r>
               <w:rPr>
                 <w:rFonts w:ascii="Times New Roman" w:eastAsia="Times New Roman" w:hAnsi="Times New Roman" w:cs="Times New Roman"/>
-                <w:b/>
-                <w:bCs/>
                 <w:sz w:val="18"/>
                 <w:szCs w:val="18"/>
                 <w:u w:val="single"/>
               </w:rPr>
-              <w:t>${</w:t>
-            </w:r>
-            <w:proofErr w:type="spellStart"/>
-            <w:r>
-              <w:rPr>
-                <w:rFonts w:ascii="Times New Roman" w:eastAsia="Times New Roman" w:hAnsi="Times New Roman" w:cs="Times New Roman"/>
-                <w:b/>
-                <w:bCs/>
-                <w:sz w:val="18"/>
-                <w:szCs w:val="18"/>
-                <w:u w:val="single"/>
-              </w:rPr>
-              <w:t>ld_hours</w:t>
-            </w:r>
-            <w:proofErr w:type="spellEnd"/>
-            <w:r>
-              <w:rPr>
-                <w:rFonts w:ascii="Times New Roman" w:eastAsia="Times New Roman" w:hAnsi="Times New Roman" w:cs="Times New Roman"/>
-                <w:b/>
-                <w:bCs/>
-                <w:sz w:val="18"/>
-                <w:szCs w:val="18"/>
-                <w:u w:val="single"/>
-              </w:rPr>
-              <w:t>}</w:t>
+              <w:t>${ld_hours}</w:t>
             </w:r>
           </w:p>
         </w:tc>
@@ -6444,8 +5057,6 @@
               <w:spacing w:after="0"/>
               <w:rPr>
                 <w:rFonts w:ascii="Times New Roman" w:eastAsia="Times New Roman" w:hAnsi="Times New Roman" w:cs="Times New Roman"/>
-                <w:b/>
-                <w:bCs/>
                 <w:sz w:val="18"/>
                 <w:szCs w:val="18"/>
                 <w:u w:val="single"/>
@@ -6454,37 +5065,11 @@
             <w:r>
               <w:rPr>
                 <w:rFonts w:ascii="Times New Roman" w:eastAsia="Times New Roman" w:hAnsi="Times New Roman" w:cs="Times New Roman"/>
-                <w:b/>
-                <w:bCs/>
                 <w:sz w:val="18"/>
                 <w:szCs w:val="18"/>
                 <w:u w:val="single"/>
               </w:rPr>
-              <w:t>${</w:t>
-            </w:r>
-            <w:proofErr w:type="spellStart"/>
-            <w:r>
-              <w:rPr>
-                <w:rFonts w:ascii="Times New Roman" w:eastAsia="Times New Roman" w:hAnsi="Times New Roman" w:cs="Times New Roman"/>
-                <w:b/>
-                <w:bCs/>
-                <w:sz w:val="18"/>
-                <w:szCs w:val="18"/>
-                <w:u w:val="single"/>
-              </w:rPr>
-              <w:t>ld_by</w:t>
-            </w:r>
-            <w:proofErr w:type="spellEnd"/>
-            <w:r>
-              <w:rPr>
-                <w:rFonts w:ascii="Times New Roman" w:eastAsia="Times New Roman" w:hAnsi="Times New Roman" w:cs="Times New Roman"/>
-                <w:b/>
-                <w:bCs/>
-                <w:sz w:val="18"/>
-                <w:szCs w:val="18"/>
-                <w:u w:val="single"/>
-              </w:rPr>
-              <w:t>}</w:t>
+              <w:t>${ld_by}</w:t>
             </w:r>
           </w:p>
         </w:tc>
@@ -6626,25 +5211,7 @@
                 <w:sz w:val="18"/>
                 <w:szCs w:val="18"/>
               </w:rPr>
-              <w:t>${</w:t>
-            </w:r>
-            <w:proofErr w:type="spellStart"/>
-            <w:r>
-              <w:rPr>
-                <w:rFonts w:ascii="Times New Roman" w:eastAsia="Times New Roman" w:hAnsi="Times New Roman" w:cs="Times New Roman"/>
-                <w:sz w:val="18"/>
-                <w:szCs w:val="18"/>
-              </w:rPr>
-              <w:t>company_name</w:t>
-            </w:r>
-            <w:proofErr w:type="spellEnd"/>
-            <w:r>
-              <w:rPr>
-                <w:rFonts w:ascii="Times New Roman" w:eastAsia="Times New Roman" w:hAnsi="Times New Roman" w:cs="Times New Roman"/>
-                <w:sz w:val="18"/>
-                <w:szCs w:val="18"/>
-              </w:rPr>
-              <w:t>}</w:t>
+              <w:t>${company_name}</w:t>
             </w:r>
           </w:p>
         </w:tc>
@@ -6733,25 +5300,7 @@
                 <w:sz w:val="18"/>
                 <w:szCs w:val="18"/>
               </w:rPr>
-              <w:t>${</w:t>
-            </w:r>
-            <w:proofErr w:type="spellStart"/>
-            <w:r>
-              <w:rPr>
-                <w:rFonts w:ascii="Times New Roman" w:eastAsia="Times New Roman" w:hAnsi="Times New Roman" w:cs="Times New Roman"/>
-                <w:sz w:val="18"/>
-                <w:szCs w:val="18"/>
-              </w:rPr>
-              <w:t>sec_registration</w:t>
-            </w:r>
-            <w:proofErr w:type="spellEnd"/>
-            <w:r>
-              <w:rPr>
-                <w:rFonts w:ascii="Times New Roman" w:eastAsia="Times New Roman" w:hAnsi="Times New Roman" w:cs="Times New Roman"/>
-                <w:sz w:val="18"/>
-                <w:szCs w:val="18"/>
-              </w:rPr>
-              <w:t>}</w:t>
+              <w:t>${sec_registration}</w:t>
             </w:r>
           </w:p>
         </w:tc>
@@ -6781,25 +5330,7 @@
                 <w:sz w:val="18"/>
                 <w:szCs w:val="18"/>
               </w:rPr>
-              <w:t>${</w:t>
-            </w:r>
-            <w:proofErr w:type="spellStart"/>
-            <w:r>
-              <w:rPr>
-                <w:rFonts w:ascii="Times New Roman" w:eastAsia="Times New Roman" w:hAnsi="Times New Roman" w:cs="Times New Roman"/>
-                <w:sz w:val="18"/>
-                <w:szCs w:val="18"/>
-              </w:rPr>
-              <w:t>startup_overview</w:t>
-            </w:r>
-            <w:proofErr w:type="spellEnd"/>
-            <w:r>
-              <w:rPr>
-                <w:rFonts w:ascii="Times New Roman" w:eastAsia="Times New Roman" w:hAnsi="Times New Roman" w:cs="Times New Roman"/>
-                <w:sz w:val="18"/>
-                <w:szCs w:val="18"/>
-              </w:rPr>
-              <w:t>}</w:t>
+              <w:t>${startup_overview}</w:t>
             </w:r>
           </w:p>
         </w:tc>
@@ -6859,25 +5390,7 @@
                 <w:sz w:val="18"/>
                 <w:szCs w:val="18"/>
               </w:rPr>
-              <w:t>${</w:t>
-            </w:r>
-            <w:proofErr w:type="spellStart"/>
-            <w:r>
-              <w:rPr>
-                <w:rFonts w:ascii="Times New Roman" w:eastAsia="Times New Roman" w:hAnsi="Times New Roman" w:cs="Times New Roman"/>
-                <w:sz w:val="18"/>
-                <w:szCs w:val="18"/>
-              </w:rPr>
-              <w:t>business_id_number</w:t>
-            </w:r>
-            <w:proofErr w:type="spellEnd"/>
-            <w:r>
-              <w:rPr>
-                <w:rFonts w:ascii="Times New Roman" w:eastAsia="Times New Roman" w:hAnsi="Times New Roman" w:cs="Times New Roman"/>
-                <w:sz w:val="18"/>
-                <w:szCs w:val="18"/>
-              </w:rPr>
-              <w:t>}</w:t>
+              <w:t>${business_id_number}</w:t>
             </w:r>
           </w:p>
         </w:tc>
@@ -6967,25 +5480,7 @@
                 <w:sz w:val="18"/>
                 <w:szCs w:val="18"/>
               </w:rPr>
-              <w:t>${</w:t>
-            </w:r>
-            <w:proofErr w:type="spellStart"/>
-            <w:r>
-              <w:rPr>
-                <w:rFonts w:ascii="Times New Roman" w:eastAsia="Times New Roman" w:hAnsi="Times New Roman" w:cs="Times New Roman"/>
-                <w:sz w:val="18"/>
-                <w:szCs w:val="18"/>
-              </w:rPr>
-              <w:t>dti_registration_number</w:t>
-            </w:r>
-            <w:proofErr w:type="spellEnd"/>
-            <w:r>
-              <w:rPr>
-                <w:rFonts w:ascii="Times New Roman" w:eastAsia="Times New Roman" w:hAnsi="Times New Roman" w:cs="Times New Roman"/>
-                <w:sz w:val="18"/>
-                <w:szCs w:val="18"/>
-              </w:rPr>
-              <w:t>}</w:t>
+              <w:t>${dti_registration_number}</w:t>
             </w:r>
           </w:p>
         </w:tc>
@@ -7075,25 +5570,7 @@
                 <w:sz w:val="18"/>
                 <w:szCs w:val="18"/>
               </w:rPr>
-              <w:t>${</w:t>
-            </w:r>
-            <w:proofErr w:type="spellStart"/>
-            <w:r>
-              <w:rPr>
-                <w:rFonts w:ascii="Times New Roman" w:eastAsia="Times New Roman" w:hAnsi="Times New Roman" w:cs="Times New Roman"/>
-                <w:sz w:val="18"/>
-                <w:szCs w:val="18"/>
-              </w:rPr>
-              <w:t>business_tin</w:t>
-            </w:r>
-            <w:proofErr w:type="spellEnd"/>
-            <w:r>
-              <w:rPr>
-                <w:rFonts w:ascii="Times New Roman" w:eastAsia="Times New Roman" w:hAnsi="Times New Roman" w:cs="Times New Roman"/>
-                <w:sz w:val="18"/>
-                <w:szCs w:val="18"/>
-              </w:rPr>
-              <w:t>}</w:t>
+              <w:t>${business_tin}</w:t>
             </w:r>
           </w:p>
         </w:tc>
@@ -7540,25 +6017,7 @@
                 <w:sz w:val="18"/>
                 <w:szCs w:val="18"/>
               </w:rPr>
-              <w:t>${</w:t>
-            </w:r>
-            <w:proofErr w:type="spellStart"/>
-            <w:r>
-              <w:rPr>
-                <w:rFonts w:ascii="Times New Roman" w:eastAsia="Times New Roman" w:hAnsi="Times New Roman" w:cs="Times New Roman"/>
-                <w:sz w:val="18"/>
-                <w:szCs w:val="18"/>
-              </w:rPr>
-              <w:t>non_academic_distinctions</w:t>
-            </w:r>
-            <w:proofErr w:type="spellEnd"/>
-            <w:r>
-              <w:rPr>
-                <w:rFonts w:ascii="Times New Roman" w:eastAsia="Times New Roman" w:hAnsi="Times New Roman" w:cs="Times New Roman"/>
-                <w:sz w:val="18"/>
-                <w:szCs w:val="18"/>
-              </w:rPr>
-              <w:t>}</w:t>
+              <w:t>${non_academic_distinctions}</w:t>
             </w:r>
           </w:p>
         </w:tc>
@@ -7587,25 +6046,7 @@
                 <w:sz w:val="18"/>
                 <w:szCs w:val="18"/>
               </w:rPr>
-              <w:t>${</w:t>
-            </w:r>
-            <w:proofErr w:type="spellStart"/>
-            <w:r>
-              <w:rPr>
-                <w:rFonts w:ascii="Times New Roman" w:eastAsia="Times New Roman" w:hAnsi="Times New Roman" w:cs="Times New Roman"/>
-                <w:sz w:val="18"/>
-                <w:szCs w:val="18"/>
-              </w:rPr>
-              <w:t>membership_associations</w:t>
-            </w:r>
-            <w:proofErr w:type="spellEnd"/>
-            <w:r>
-              <w:rPr>
-                <w:rFonts w:ascii="Times New Roman" w:eastAsia="Times New Roman" w:hAnsi="Times New Roman" w:cs="Times New Roman"/>
-                <w:sz w:val="18"/>
-                <w:szCs w:val="18"/>
-              </w:rPr>
-              <w:t>}</w:t>
+              <w:t>${membership_associations}</w:t>
             </w:r>
           </w:p>
         </w:tc>
@@ -7925,23 +6366,7 @@
                 <w:rFonts w:ascii="Times New Roman" w:eastAsia="Times New Roman" w:hAnsi="Times New Roman" w:cs="Times New Roman"/>
                 <w:sz w:val="18"/>
               </w:rPr>
-              <w:t>${</w:t>
-            </w:r>
-            <w:proofErr w:type="spellStart"/>
-            <w:r>
-              <w:rPr>
-                <w:rFonts w:ascii="Times New Roman" w:eastAsia="Times New Roman" w:hAnsi="Times New Roman" w:cs="Times New Roman"/>
-                <w:sz w:val="18"/>
-              </w:rPr>
-              <w:t>ref_name</w:t>
-            </w:r>
-            <w:proofErr w:type="spellEnd"/>
-            <w:r>
-              <w:rPr>
-                <w:rFonts w:ascii="Times New Roman" w:eastAsia="Times New Roman" w:hAnsi="Times New Roman" w:cs="Times New Roman"/>
-                <w:sz w:val="18"/>
-              </w:rPr>
-              <w:t>}</w:t>
+              <w:t>${ref_name}</w:t>
             </w:r>
           </w:p>
         </w:tc>
@@ -7974,23 +6399,7 @@
                 <w:rFonts w:ascii="Times New Roman" w:eastAsia="Times New Roman" w:hAnsi="Times New Roman" w:cs="Times New Roman"/>
                 <w:sz w:val="18"/>
               </w:rPr>
-              <w:t>${</w:t>
-            </w:r>
-            <w:proofErr w:type="spellStart"/>
-            <w:r>
-              <w:rPr>
-                <w:rFonts w:ascii="Times New Roman" w:eastAsia="Times New Roman" w:hAnsi="Times New Roman" w:cs="Times New Roman"/>
-                <w:sz w:val="18"/>
-              </w:rPr>
-              <w:t>ref_contact</w:t>
-            </w:r>
-            <w:proofErr w:type="spellEnd"/>
-            <w:r>
-              <w:rPr>
-                <w:rFonts w:ascii="Times New Roman" w:eastAsia="Times New Roman" w:hAnsi="Times New Roman" w:cs="Times New Roman"/>
-                <w:sz w:val="18"/>
-              </w:rPr>
-              <w:t>}</w:t>
+              <w:t>${ref_contact}</w:t>
             </w:r>
           </w:p>
         </w:tc>
@@ -8023,23 +6432,7 @@
                 <w:rFonts w:ascii="Times New Roman" w:eastAsia="Times New Roman" w:hAnsi="Times New Roman" w:cs="Times New Roman"/>
                 <w:sz w:val="18"/>
               </w:rPr>
-              <w:t>${</w:t>
-            </w:r>
-            <w:proofErr w:type="spellStart"/>
-            <w:r>
-              <w:rPr>
-                <w:rFonts w:ascii="Times New Roman" w:eastAsia="Times New Roman" w:hAnsi="Times New Roman" w:cs="Times New Roman"/>
-                <w:sz w:val="18"/>
-              </w:rPr>
-              <w:t>ref_email</w:t>
-            </w:r>
-            <w:proofErr w:type="spellEnd"/>
-            <w:r>
-              <w:rPr>
-                <w:rFonts w:ascii="Times New Roman" w:eastAsia="Times New Roman" w:hAnsi="Times New Roman" w:cs="Times New Roman"/>
-                <w:sz w:val="18"/>
-              </w:rPr>
-              <w:t>}</w:t>
+              <w:t>${ref_email}</w:t>
             </w:r>
           </w:p>
         </w:tc>
@@ -8072,23 +6465,7 @@
                 <w:rFonts w:ascii="Times New Roman" w:eastAsia="Times New Roman" w:hAnsi="Times New Roman" w:cs="Times New Roman"/>
                 <w:sz w:val="18"/>
               </w:rPr>
-              <w:t>${</w:t>
-            </w:r>
-            <w:proofErr w:type="spellStart"/>
-            <w:r>
-              <w:rPr>
-                <w:rFonts w:ascii="Times New Roman" w:eastAsia="Times New Roman" w:hAnsi="Times New Roman" w:cs="Times New Roman"/>
-                <w:sz w:val="18"/>
-              </w:rPr>
-              <w:t>ref_address</w:t>
-            </w:r>
-            <w:proofErr w:type="spellEnd"/>
-            <w:r>
-              <w:rPr>
-                <w:rFonts w:ascii="Times New Roman" w:eastAsia="Times New Roman" w:hAnsi="Times New Roman" w:cs="Times New Roman"/>
-                <w:sz w:val="18"/>
-              </w:rPr>
-              <w:t>}</w:t>
+              <w:t>${ref_address}</w:t>
             </w:r>
           </w:p>
         </w:tc>
@@ -8626,23 +7003,7 @@
                 <w:rFonts w:ascii="Times New Roman" w:eastAsia="Times New Roman" w:hAnsi="Times New Roman" w:cs="Times New Roman"/>
                 <w:sz w:val="18"/>
               </w:rPr>
-              <w:t>${</w:t>
-            </w:r>
-            <w:proofErr w:type="spellStart"/>
-            <w:r>
-              <w:rPr>
-                <w:rFonts w:ascii="Times New Roman" w:eastAsia="Times New Roman" w:hAnsi="Times New Roman" w:cs="Times New Roman"/>
-                <w:sz w:val="18"/>
-              </w:rPr>
-              <w:t>date_accomplished</w:t>
-            </w:r>
-            <w:proofErr w:type="spellEnd"/>
-            <w:r>
-              <w:rPr>
-                <w:rFonts w:ascii="Times New Roman" w:eastAsia="Times New Roman" w:hAnsi="Times New Roman" w:cs="Times New Roman"/>
-                <w:sz w:val="18"/>
-              </w:rPr>
-              <w:t>}</w:t>
+              <w:t>${date_accomplished}</w:t>
             </w:r>
           </w:p>
         </w:tc>
@@ -9041,25 +7402,7 @@
                 <w:sz w:val="18"/>
                 <w:szCs w:val="18"/>
               </w:rPr>
-              <w:t>${</w:t>
-            </w:r>
-            <w:proofErr w:type="spellStart"/>
-            <w:r>
-              <w:rPr>
-                <w:rFonts w:ascii="Times New Roman" w:eastAsia="Times New Roman" w:hAnsi="Times New Roman" w:cs="Times New Roman"/>
-                <w:sz w:val="18"/>
-                <w:szCs w:val="18"/>
-              </w:rPr>
-              <w:t>portfolio_manager</w:t>
-            </w:r>
-            <w:proofErr w:type="spellEnd"/>
-            <w:r>
-              <w:rPr>
-                <w:rFonts w:ascii="Times New Roman" w:eastAsia="Times New Roman" w:hAnsi="Times New Roman" w:cs="Times New Roman"/>
-                <w:sz w:val="18"/>
-                <w:szCs w:val="18"/>
-              </w:rPr>
-              <w:t>}</w:t>
+              <w:t>${portfolio_manager}</w:t>
             </w:r>
           </w:p>
         </w:tc>
@@ -9271,25 +7614,7 @@
                 <w:sz w:val="18"/>
                 <w:szCs w:val="18"/>
               </w:rPr>
-              <w:t>${</w:t>
-            </w:r>
-            <w:proofErr w:type="spellStart"/>
-            <w:r>
-              <w:rPr>
-                <w:rFonts w:ascii="Times New Roman" w:eastAsia="Times New Roman" w:hAnsi="Times New Roman" w:cs="Times New Roman"/>
-                <w:sz w:val="18"/>
-                <w:szCs w:val="18"/>
-              </w:rPr>
-              <w:t>cohort_no</w:t>
-            </w:r>
-            <w:proofErr w:type="spellEnd"/>
-            <w:r>
-              <w:rPr>
-                <w:rFonts w:ascii="Times New Roman" w:eastAsia="Times New Roman" w:hAnsi="Times New Roman" w:cs="Times New Roman"/>
-                <w:sz w:val="18"/>
-                <w:szCs w:val="18"/>
-              </w:rPr>
-              <w:t>}</w:t>
+              <w:t>${cohort_no}</w:t>
             </w:r>
           </w:p>
         </w:tc>
@@ -9387,25 +7712,7 @@
                 <w:sz w:val="18"/>
                 <w:szCs w:val="18"/>
               </w:rPr>
-              <w:t>${</w:t>
-            </w:r>
-            <w:proofErr w:type="spellStart"/>
-            <w:r>
-              <w:rPr>
-                <w:rFonts w:ascii="Times New Roman" w:eastAsia="Times New Roman" w:hAnsi="Times New Roman" w:cs="Times New Roman"/>
-                <w:sz w:val="18"/>
-                <w:szCs w:val="18"/>
-              </w:rPr>
-              <w:t>endorsed_by</w:t>
-            </w:r>
-            <w:proofErr w:type="spellEnd"/>
-            <w:r>
-              <w:rPr>
-                <w:rFonts w:ascii="Times New Roman" w:eastAsia="Times New Roman" w:hAnsi="Times New Roman" w:cs="Times New Roman"/>
-                <w:sz w:val="18"/>
-                <w:szCs w:val="18"/>
-              </w:rPr>
-              <w:t>}</w:t>
+              <w:t>${endorsed_by}</w:t>
             </w:r>
           </w:p>
         </w:tc>
@@ -9492,25 +7799,7 @@
                 <w:sz w:val="18"/>
                 <w:szCs w:val="18"/>
               </w:rPr>
-              <w:t>${</w:t>
-            </w:r>
-            <w:proofErr w:type="spellStart"/>
-            <w:r>
-              <w:rPr>
-                <w:rFonts w:ascii="Times New Roman" w:eastAsia="Times New Roman" w:hAnsi="Times New Roman" w:cs="Times New Roman"/>
-                <w:sz w:val="18"/>
-                <w:szCs w:val="18"/>
-              </w:rPr>
-              <w:t>endorsement_date</w:t>
-            </w:r>
-            <w:proofErr w:type="spellEnd"/>
-            <w:r>
-              <w:rPr>
-                <w:rFonts w:ascii="Times New Roman" w:eastAsia="Times New Roman" w:hAnsi="Times New Roman" w:cs="Times New Roman"/>
-                <w:sz w:val="18"/>
-                <w:szCs w:val="18"/>
-              </w:rPr>
-              <w:t>}</w:t>
+              <w:t>${endorsement_date}</w:t>
             </w:r>
           </w:p>
         </w:tc>
@@ -9633,27 +7922,7 @@
         <w:sz w:val="16"/>
         <w:szCs w:val="16"/>
       </w:rPr>
-      <w:t xml:space="preserve">PUP A. Mabini Campus, </w:t>
-    </w:r>
-    <w:proofErr w:type="spellStart"/>
-    <w:r>
-      <w:rPr>
-        <w:rFonts w:ascii="Arial" w:eastAsia="Arial" w:hAnsi="Arial" w:cs="Arial"/>
-        <w:color w:val="000000"/>
-        <w:sz w:val="16"/>
-        <w:szCs w:val="16"/>
-      </w:rPr>
-      <w:t>Anonas</w:t>
-    </w:r>
-    <w:proofErr w:type="spellEnd"/>
-    <w:r>
-      <w:rPr>
-        <w:rFonts w:ascii="Arial" w:eastAsia="Arial" w:hAnsi="Arial" w:cs="Arial"/>
-        <w:color w:val="000000"/>
-        <w:sz w:val="16"/>
-        <w:szCs w:val="16"/>
-      </w:rPr>
-      <w:t xml:space="preserve"> Street, Sta. Mesa, Manila 1016</w:t>
+      <w:t>PUP A. Mabini Campus, Anonas Street, Sta. Mesa, Manila 1016</w:t>
     </w:r>
     <w:r>
       <w:rPr>
@@ -9926,27 +8195,7 @@
         <w:sz w:val="16"/>
         <w:szCs w:val="16"/>
       </w:rPr>
-      <w:t xml:space="preserve">PUP A. Mabini Campus, </w:t>
-    </w:r>
-    <w:proofErr w:type="spellStart"/>
-    <w:r>
-      <w:rPr>
-        <w:rFonts w:ascii="Arial" w:eastAsia="Arial" w:hAnsi="Arial" w:cs="Arial"/>
-        <w:color w:val="000000"/>
-        <w:sz w:val="16"/>
-        <w:szCs w:val="16"/>
-      </w:rPr>
-      <w:t>Anonas</w:t>
-    </w:r>
-    <w:proofErr w:type="spellEnd"/>
-    <w:r>
-      <w:rPr>
-        <w:rFonts w:ascii="Arial" w:eastAsia="Arial" w:hAnsi="Arial" w:cs="Arial"/>
-        <w:color w:val="000000"/>
-        <w:sz w:val="16"/>
-        <w:szCs w:val="16"/>
-      </w:rPr>
-      <w:t xml:space="preserve"> Street, Sta. Mesa, Manila 1016</w:t>
+      <w:t>PUP A. Mabini Campus, Anonas Street, Sta. Mesa, Manila 1016</w:t>
     </w:r>
     <w:r>
       <w:rPr>
@@ -11629,7 +9878,6 @@
   <w:style w:type="character" w:default="1" w:styleId="DefaultParagraphFont">
     <w:name w:val="Default Paragraph Font"/>
     <w:uiPriority w:val="1"/>
-    <w:semiHidden/>
     <w:unhideWhenUsed/>
   </w:style>
   <w:style w:type="table" w:default="1" w:styleId="TableNormal">

</xml_diff>